<commit_message>
Enhance management fee calculation logic and UI, including new base amount fetching methods and report formatting improvements.
</commit_message>
<xml_diff>
--- a/ManagementFeeCalculation.docx
+++ b/ManagementFeeCalculation.docx
@@ -7,12 +7,12 @@
         <w:tblStyle w:val="TableGrid"/>
         <w:tblW w:w="0" w:type="auto"/>
         <w:tblBorders>
-          <w:top w:val="none" w:color="auto" w:sz="0" w:space="0"/>
-          <w:left w:val="none" w:color="auto" w:sz="0" w:space="0"/>
-          <w:bottom w:val="none" w:color="auto" w:sz="0" w:space="0"/>
-          <w:right w:val="none" w:color="auto" w:sz="0" w:space="0"/>
-          <w:insideH w:val="none" w:color="auto" w:sz="0" w:space="0"/>
-          <w:insideV w:val="none" w:color="auto" w:sz="0" w:space="0"/>
+          <w:top w:val="none" w:sz="0" w:space="0" w:color="auto"/>
+          <w:left w:val="none" w:sz="0" w:space="0" w:color="auto"/>
+          <w:bottom w:val="none" w:sz="0" w:space="0" w:color="auto"/>
+          <w:right w:val="none" w:sz="0" w:space="0" w:color="auto"/>
+          <w:insideH w:val="none" w:sz="0" w:space="0" w:color="auto"/>
+          <w:insideV w:val="none" w:sz="0" w:space="0" w:color="auto"/>
         </w:tblBorders>
         <w:tblLook w:val="04A0" w:firstRow="1" w:lastRow="0" w:firstColumn="1" w:lastColumn="0" w:noHBand="0" w:noVBand="1"/>
       </w:tblPr>
@@ -53,11 +53,13 @@
               <w:b/>
               <w:bCs/>
             </w:rPr>
-            <w:id w:val="297260427"/>
+            <w:alias w:val="#Nav: /Management_Fee_Calc_Header/Report_Date"/>
+            <w:tag w:val="#Nav: Management_Fee_Calculation/50119"/>
+            <w:id w:val="2058429919"/>
             <w:placeholder>
-              <w:docPart w:val="038AF384FC704000903F580644033573"/>
+              <w:docPart w:val="DefaultPlaceholder_-1854013440"/>
             </w:placeholder>
-            <w:dataBinding w:prefixMappings="xmlns:ns0='urn:microsoft-dynamics-businesscentral/internal/extended/reports/Management_Fee_Calculation/50119/' " w:xpath="/ns0:NavWordReportXmlPart[1]/ns0:Management_Fee_Calc_Header[1]/ns0:Report_Date[1]" w:storeItemID="{F7209D94-4632-4C4E-B694-D48DD89A699E}"/>
+            <w:dataBinding w:prefixMappings="xmlns:ns0='urn:microsoft-dynamics-nav/reports/Management_Fee_Calculation/50119/' " w:xpath="/ns0:NavWordReportXmlPart[1]/ns0:Management_Fee_Calc_Header[1]/ns0:Report_Date[1]" w:storeItemID="{F525D34B-9F89-4FBE-9311-0F7E641D4220}"/>
             <w:text/>
           </w:sdtPr>
           <w:sdtContent>
@@ -74,6 +76,7 @@
                     <w:bCs/>
                   </w:rPr>
                 </w:pPr>
+                <w:proofErr w:type="spellStart"/>
                 <w:r>
                   <w:rPr>
                     <w:rFonts w:ascii="Aptos Display" w:hAnsi="Aptos Display"/>
@@ -82,6 +85,7 @@
                   </w:rPr>
                   <w:t>Report_Date</w:t>
                 </w:r>
+                <w:proofErr w:type="spellEnd"/>
               </w:p>
             </w:tc>
           </w:sdtContent>
@@ -112,11 +116,13 @@
               <w:b/>
               <w:bCs/>
             </w:rPr>
-            <w:id w:val="-620306158"/>
+            <w:alias w:val="#Nav: /Management_Fee_Calc_Header/Financial_Year"/>
+            <w:tag w:val="#Nav: Management_Fee_Calculation/50119"/>
+            <w:id w:val="1741667557"/>
             <w:placeholder>
-              <w:docPart w:val="CF45DAA9D5F549DAA360542D058A64D5"/>
+              <w:docPart w:val="DefaultPlaceholder_-1854013440"/>
             </w:placeholder>
-            <w:dataBinding w:prefixMappings="xmlns:ns0='urn:microsoft-dynamics-businesscentral/internal/extended/reports/Management_Fee_Calculation/50119/' " w:xpath="/ns0:NavWordReportXmlPart[1]/ns0:Management_Fee_Calc_Header[1]/ns0:Financial_Year[1]" w:storeItemID="{F7209D94-4632-4C4E-B694-D48DD89A699E}"/>
+            <w:dataBinding w:prefixMappings="xmlns:ns0='urn:microsoft-dynamics-nav/reports/Management_Fee_Calculation/50119/' " w:xpath="/ns0:NavWordReportXmlPart[1]/ns0:Management_Fee_Calc_Header[1]/ns0:Financial_Year[1]" w:storeItemID="{F525D34B-9F89-4FBE-9311-0F7E641D4220}"/>
             <w:text/>
           </w:sdtPr>
           <w:sdtContent>
@@ -129,8 +135,11 @@
                 <w:pPr>
                   <w:rPr>
                     <w:rFonts w:ascii="Aptos Display" w:hAnsi="Aptos Display"/>
+                    <w:b/>
+                    <w:bCs/>
                   </w:rPr>
                 </w:pPr>
+                <w:proofErr w:type="spellStart"/>
                 <w:r>
                   <w:rPr>
                     <w:rFonts w:ascii="Aptos Display" w:hAnsi="Aptos Display"/>
@@ -139,6 +148,7 @@
                   </w:rPr>
                   <w:t>Financial_Year</w:t>
                 </w:r>
+                <w:proofErr w:type="spellEnd"/>
               </w:p>
             </w:tc>
           </w:sdtContent>
@@ -188,11 +198,13 @@
               <w:bCs/>
               <w:color w:val="EE0000"/>
             </w:rPr>
-            <w:id w:val="-1146663306"/>
+            <w:alias w:val="#Nav: /Management_Fee_Calc_Header/Owner_Name"/>
+            <w:tag w:val="#Nav: Management_Fee_Calculation/50119"/>
+            <w:id w:val="-1118436684"/>
             <w:placeholder>
-              <w:docPart w:val="84FE0A378D7E4B67B305160FC405DE9F"/>
+              <w:docPart w:val="DefaultPlaceholder_-1854013440"/>
             </w:placeholder>
-            <w:dataBinding w:prefixMappings="xmlns:ns0='urn:microsoft-dynamics-businesscentral/internal/extended/reports/Management_Fee_Calculation/50119/' " w:xpath="/ns0:NavWordReportXmlPart[1]/ns0:Management_Fee_Calc_Header[1]/ns0:Owner_Name[1]" w:storeItemID="{F7209D94-4632-4C4E-B694-D48DD89A699E}"/>
+            <w:dataBinding w:prefixMappings="xmlns:ns0='urn:microsoft-dynamics-nav/reports/Management_Fee_Calculation/50119/' " w:xpath="/ns0:NavWordReportXmlPart[1]/ns0:Management_Fee_Calc_Header[1]/ns0:Owner_Name[1]" w:storeItemID="{F525D34B-9F89-4FBE-9311-0F7E641D4220}"/>
             <w:text/>
           </w:sdtPr>
           <w:sdtContent>
@@ -211,6 +223,7 @@
                     <w:color w:val="EE0000"/>
                   </w:rPr>
                 </w:pPr>
+                <w:proofErr w:type="spellStart"/>
                 <w:r>
                   <w:rPr>
                     <w:rFonts w:ascii="Aptos Display" w:hAnsi="Aptos Display"/>
@@ -220,6 +233,7 @@
                   </w:rPr>
                   <w:t>Owner_Name</w:t>
                 </w:r>
+                <w:proofErr w:type="spellEnd"/>
               </w:p>
             </w:tc>
           </w:sdtContent>
@@ -256,11 +270,13 @@
               <w:bCs/>
               <w:color w:val="EE0000"/>
             </w:rPr>
-            <w:id w:val="-1307317674"/>
+            <w:alias w:val="#Nav: /Management_Fee_Calc_Header/Property"/>
+            <w:tag w:val="#Nav: Management_Fee_Calculation/50119"/>
+            <w:id w:val="909582850"/>
             <w:placeholder>
-              <w:docPart w:val="84FE0A378D7E4B67B305160FC405DE9F"/>
+              <w:docPart w:val="DefaultPlaceholder_-1854013440"/>
             </w:placeholder>
-            <w:dataBinding w:prefixMappings="xmlns:ns0='urn:microsoft-dynamics-businesscentral/internal/extended/reports/Management_Fee_Calculation/50119/' " w:xpath="/ns0:NavWordReportXmlPart[1]/ns0:Management_Fee_Calc_Header[1]/ns0:Property[1]" w:storeItemID="{F7209D94-4632-4C4E-B694-D48DD89A699E}"/>
+            <w:dataBinding w:prefixMappings="xmlns:ns0='urn:microsoft-dynamics-nav/reports/Management_Fee_Calculation/50119/' " w:xpath="/ns0:NavWordReportXmlPart[1]/ns0:Management_Fee_Calc_Header[1]/ns0:Property[1]" w:storeItemID="{F525D34B-9F89-4FBE-9311-0F7E641D4220}"/>
             <w:text/>
           </w:sdtPr>
           <w:sdtContent>
@@ -363,11 +379,13 @@
               <w:b/>
               <w:bCs/>
             </w:rPr>
-            <w:id w:val="608087571"/>
+            <w:alias w:val="#Nav: /Management_Fee_Calc_Header/Period_From"/>
+            <w:tag w:val="#Nav: Management_Fee_Calculation/50119"/>
+            <w:id w:val="1123507900"/>
             <w:placeholder>
-              <w:docPart w:val="84FE0A378D7E4B67B305160FC405DE9F"/>
+              <w:docPart w:val="DefaultPlaceholder_-1854013440"/>
             </w:placeholder>
-            <w:dataBinding w:prefixMappings="xmlns:ns0='urn:microsoft-dynamics-businesscentral/internal/extended/reports/Management_Fee_Calculation/50119/' " w:xpath="/ns0:NavWordReportXmlPart[1]/ns0:Management_Fee_Calc_Header[1]/ns0:Period_From[1]" w:storeItemID="{F7209D94-4632-4C4E-B694-D48DD89A699E}"/>
+            <w:dataBinding w:prefixMappings="xmlns:ns0='urn:microsoft-dynamics-nav/reports/Management_Fee_Calculation/50119/' " w:xpath="/ns0:NavWordReportXmlPart[1]/ns0:Management_Fee_Calc_Header[1]/ns0:Period_From[1]" w:storeItemID="{F525D34B-9F89-4FBE-9311-0F7E641D4220}"/>
             <w:text/>
           </w:sdtPr>
           <w:sdtContent>
@@ -384,6 +402,7 @@
                     <w:bCs/>
                   </w:rPr>
                 </w:pPr>
+                <w:proofErr w:type="spellStart"/>
                 <w:r>
                   <w:rPr>
                     <w:rFonts w:ascii="Aptos Display" w:hAnsi="Aptos Display"/>
@@ -392,6 +411,7 @@
                   </w:rPr>
                   <w:t>Period_From</w:t>
                 </w:r>
+                <w:proofErr w:type="spellEnd"/>
               </w:p>
             </w:tc>
           </w:sdtContent>
@@ -422,11 +442,13 @@
               <w:b/>
               <w:bCs/>
             </w:rPr>
-            <w:id w:val="53900206"/>
+            <w:alias w:val="#Nav: /Management_Fee_Calc_Header/Period_To"/>
+            <w:tag w:val="#Nav: Management_Fee_Calculation/50119"/>
+            <w:id w:val="-375855840"/>
             <w:placeholder>
-              <w:docPart w:val="84FE0A378D7E4B67B305160FC405DE9F"/>
+              <w:docPart w:val="DefaultPlaceholder_-1854013440"/>
             </w:placeholder>
-            <w:dataBinding w:prefixMappings="xmlns:ns0='urn:microsoft-dynamics-businesscentral/internal/extended/reports/Management_Fee_Calculation/50119/' " w:xpath="/ns0:NavWordReportXmlPart[1]/ns0:Management_Fee_Calc_Header[1]/ns0:Period_To[1]" w:storeItemID="{F7209D94-4632-4C4E-B694-D48DD89A699E}"/>
+            <w:dataBinding w:prefixMappings="xmlns:ns0='urn:microsoft-dynamics-nav/reports/Management_Fee_Calculation/50119/' " w:xpath="/ns0:NavWordReportXmlPart[1]/ns0:Management_Fee_Calc_Header[1]/ns0:Period_To[1]" w:storeItemID="{F525D34B-9F89-4FBE-9311-0F7E641D4220}"/>
             <w:text/>
           </w:sdtPr>
           <w:sdtContent>
@@ -443,6 +465,7 @@
                     <w:bCs/>
                   </w:rPr>
                 </w:pPr>
+                <w:proofErr w:type="spellStart"/>
                 <w:r>
                   <w:rPr>
                     <w:rFonts w:ascii="Aptos Display" w:hAnsi="Aptos Display"/>
@@ -451,6 +474,7 @@
                   </w:rPr>
                   <w:t>Period_To</w:t>
                 </w:r>
+                <w:proofErr w:type="spellEnd"/>
               </w:p>
             </w:tc>
           </w:sdtContent>
@@ -917,14 +941,14 @@
         <w:sdtPr>
           <w:alias w:val="#Nav: /Management_Fee_Calc_Header/Management_Fee_Calc_Line"/>
           <w:tag w:val="#Nav: Management_Fee_Calculation/50119"/>
-          <w:id w:val="-921019902"/>
-          <w15:dataBinding w:prefixMappings="xmlns:ns0='urn:microsoft-dynamics-nav/reports/Management_Fee_Calculation/50119/'" w:xpath="/ns0:NavWordReportXmlPart[1]/ns0:Management_Fee_Calc_Header[1]/ns0:Management_Fee_Calc_Line" w:storeItemID="{F7209D94-4632-4C4E-B694-D48DD89A699E}"/>
+          <w:id w:val="498853624"/>
+          <w15:dataBinding w:prefixMappings="xmlns:ns0='urn:microsoft-dynamics-nav/reports/Management_Fee_Calculation/50119/' " w:xpath="/ns0:NavWordReportXmlPart[1]/ns0:Management_Fee_Calc_Header[1]/ns0:Management_Fee_Calc_Line" w:storeItemID="{F525D34B-9F89-4FBE-9311-0F7E641D4220}"/>
           <w15:repeatingSection/>
         </w:sdtPr>
         <w:sdtContent>
           <w:sdt>
             <w:sdtPr>
-              <w:id w:val="-1394337966"/>
+              <w:id w:val="1766341448"/>
               <w:placeholder>
                 <w:docPart w:val="DefaultPlaceholder_-1854013435"/>
               </w:placeholder>
@@ -934,11 +958,13 @@
               <w:tr>
                 <w:sdt>
                   <w:sdtPr>
-                    <w:id w:val="-1984296194"/>
+                    <w:alias w:val="#Nav: /Management_Fee_Calc_Header/Management_Fee_Calc_Line/Property_Management_Company"/>
+                    <w:tag w:val="#Nav: Management_Fee_Calculation/50119"/>
+                    <w:id w:val="-43369142"/>
                     <w:placeholder>
                       <w:docPart w:val="DefaultPlaceholder_-1854013440"/>
                     </w:placeholder>
-                    <w:dataBinding w:prefixMappings="xmlns:ns0='urn:microsoft-dynamics-businesscentral/internal/extended/reports/Management_Fee_Calculation/50119/' " w:xpath="/ns0:NavWordReportXmlPart[1]/ns0:Management_Fee_Calc_Header[1]/ns0:Management_Fee_Calc_Line[1]/ns0:Property_Management_Company[1]" w:storeItemID="{F7209D94-4632-4C4E-B694-D48DD89A699E}"/>
+                    <w:dataBinding w:prefixMappings="xmlns:ns0='urn:microsoft-dynamics-nav/reports/Management_Fee_Calculation/50119/' " w:xpath="/ns0:NavWordReportXmlPart[1]/ns0:Management_Fee_Calc_Header[1]/ns0:Management_Fee_Calc_Line[1]/ns0:Property_Management_Company[1]" w:storeItemID="{F525D34B-9F89-4FBE-9311-0F7E641D4220}"/>
                     <w:text/>
                   </w:sdtPr>
                   <w:sdtContent>
@@ -948,20 +974,24 @@
                         <w:vAlign w:val="center"/>
                       </w:tcPr>
                       <w:p>
+                        <w:proofErr w:type="spellStart"/>
                         <w:r>
                           <w:t>Property_Management_Company</w:t>
                         </w:r>
+                        <w:proofErr w:type="spellEnd"/>
                       </w:p>
                     </w:tc>
                   </w:sdtContent>
                 </w:sdt>
                 <w:sdt>
                   <w:sdtPr>
-                    <w:id w:val="-54015052"/>
+                    <w:alias w:val="#Nav: /Management_Fee_Calc_Header/Management_Fee_Calc_Line/Company_Owner_Name"/>
+                    <w:tag w:val="#Nav: Management_Fee_Calculation/50119"/>
+                    <w:id w:val="-736636723"/>
                     <w:placeholder>
                       <w:docPart w:val="DefaultPlaceholder_-1854013440"/>
                     </w:placeholder>
-                    <w:dataBinding w:prefixMappings="xmlns:ns0='urn:microsoft-dynamics-businesscentral/internal/extended/reports/Management_Fee_Calculation/50119/' " w:xpath="/ns0:NavWordReportXmlPart[1]/ns0:Management_Fee_Calc_Header[1]/ns0:Management_Fee_Calc_Line[1]/ns0:Company_Owner_Name[1]" w:storeItemID="{F7209D94-4632-4C4E-B694-D48DD89A699E}"/>
+                    <w:dataBinding w:prefixMappings="xmlns:ns0='urn:microsoft-dynamics-nav/reports/Management_Fee_Calculation/50119/' " w:xpath="/ns0:NavWordReportXmlPart[1]/ns0:Management_Fee_Calc_Header[1]/ns0:Management_Fee_Calc_Line[1]/ns0:Company_Owner_Name[1]" w:storeItemID="{F525D34B-9F89-4FBE-9311-0F7E641D4220}"/>
                     <w:text/>
                   </w:sdtPr>
                   <w:sdtContent>
@@ -971,20 +1001,24 @@
                         <w:vAlign w:val="center"/>
                       </w:tcPr>
                       <w:p>
+                        <w:proofErr w:type="spellStart"/>
                         <w:r>
                           <w:t>Company_Owner_Name</w:t>
                         </w:r>
+                        <w:proofErr w:type="spellEnd"/>
                       </w:p>
                     </w:tc>
                   </w:sdtContent>
                 </w:sdt>
                 <w:sdt>
                   <w:sdtPr>
-                    <w:id w:val="1078248031"/>
+                    <w:alias w:val="#Nav: /Management_Fee_Calc_Header/Management_Fee_Calc_Line/Property_Name"/>
+                    <w:tag w:val="#Nav: Management_Fee_Calculation/50119"/>
+                    <w:id w:val="1740751127"/>
                     <w:placeholder>
                       <w:docPart w:val="DefaultPlaceholder_-1854013440"/>
                     </w:placeholder>
-                    <w:dataBinding w:prefixMappings="xmlns:ns0='urn:microsoft-dynamics-businesscentral/internal/extended/reports/Management_Fee_Calculation/50119/' " w:xpath="/ns0:NavWordReportXmlPart[1]/ns0:Management_Fee_Calc_Header[1]/ns0:Management_Fee_Calc_Line[1]/ns0:Property_Name[1]" w:storeItemID="{F7209D94-4632-4C4E-B694-D48DD89A699E}"/>
+                    <w:dataBinding w:prefixMappings="xmlns:ns0='urn:microsoft-dynamics-nav/reports/Management_Fee_Calculation/50119/' " w:xpath="/ns0:NavWordReportXmlPart[1]/ns0:Management_Fee_Calc_Header[1]/ns0:Management_Fee_Calc_Line[1]/ns0:Property_Name[1]" w:storeItemID="{F525D34B-9F89-4FBE-9311-0F7E641D4220}"/>
                     <w:text/>
                   </w:sdtPr>
                   <w:sdtContent>
@@ -994,20 +1028,24 @@
                         <w:vAlign w:val="center"/>
                       </w:tcPr>
                       <w:p>
+                        <w:proofErr w:type="spellStart"/>
                         <w:r>
                           <w:t>Property_Name</w:t>
                         </w:r>
+                        <w:proofErr w:type="spellEnd"/>
                       </w:p>
                     </w:tc>
                   </w:sdtContent>
                 </w:sdt>
                 <w:sdt>
                   <w:sdtPr>
-                    <w:id w:val="621743931"/>
+                    <w:alias w:val="#Nav: /Management_Fee_Calc_Header/Management_Fee_Calc_Line/Property_Type"/>
+                    <w:tag w:val="#Nav: Management_Fee_Calculation/50119"/>
+                    <w:id w:val="-687055522"/>
                     <w:placeholder>
                       <w:docPart w:val="DefaultPlaceholder_-1854013440"/>
                     </w:placeholder>
-                    <w:dataBinding w:prefixMappings="xmlns:ns0='urn:microsoft-dynamics-businesscentral/internal/extended/reports/Management_Fee_Calculation/50119/' " w:xpath="/ns0:NavWordReportXmlPart[1]/ns0:Management_Fee_Calc_Header[1]/ns0:Management_Fee_Calc_Line[1]/ns0:Property_Type[1]" w:storeItemID="{F7209D94-4632-4C4E-B694-D48DD89A699E}"/>
+                    <w:dataBinding w:prefixMappings="xmlns:ns0='urn:microsoft-dynamics-nav/reports/Management_Fee_Calculation/50119/' " w:xpath="/ns0:NavWordReportXmlPart[1]/ns0:Management_Fee_Calc_Header[1]/ns0:Management_Fee_Calc_Line[1]/ns0:Property_Type[1]" w:storeItemID="{F525D34B-9F89-4FBE-9311-0F7E641D4220}"/>
                     <w:text/>
                   </w:sdtPr>
                   <w:sdtContent>
@@ -1017,20 +1055,24 @@
                         <w:vAlign w:val="center"/>
                       </w:tcPr>
                       <w:p>
+                        <w:proofErr w:type="spellStart"/>
                         <w:r>
                           <w:t>Property_Type</w:t>
                         </w:r>
+                        <w:proofErr w:type="spellEnd"/>
                       </w:p>
                     </w:tc>
                   </w:sdtContent>
                 </w:sdt>
                 <w:sdt>
                   <w:sdtPr>
-                    <w:id w:val="-1827433300"/>
+                    <w:alias w:val="#Nav: /Management_Fee_Calc_Header/Management_Fee_Calc_Line/Calculation_Method"/>
+                    <w:tag w:val="#Nav: Management_Fee_Calculation/50119"/>
+                    <w:id w:val="419295985"/>
                     <w:placeholder>
                       <w:docPart w:val="DefaultPlaceholder_-1854013440"/>
                     </w:placeholder>
-                    <w:dataBinding w:prefixMappings="xmlns:ns0='urn:microsoft-dynamics-businesscentral/internal/extended/reports/Management_Fee_Calculation/50119/' " w:xpath="/ns0:NavWordReportXmlPart[1]/ns0:Management_Fee_Calc_Header[1]/ns0:Management_Fee_Calc_Line[1]/ns0:Calculation_Method[1]" w:storeItemID="{F7209D94-4632-4C4E-B694-D48DD89A699E}"/>
+                    <w:dataBinding w:prefixMappings="xmlns:ns0='urn:microsoft-dynamics-nav/reports/Management_Fee_Calculation/50119/' " w:xpath="/ns0:NavWordReportXmlPart[1]/ns0:Management_Fee_Calc_Header[1]/ns0:Management_Fee_Calc_Line[1]/ns0:Calculation_Method[1]" w:storeItemID="{F525D34B-9F89-4FBE-9311-0F7E641D4220}"/>
                     <w:text/>
                   </w:sdtPr>
                   <w:sdtContent>
@@ -1040,20 +1082,24 @@
                         <w:vAlign w:val="center"/>
                       </w:tcPr>
                       <w:p>
+                        <w:proofErr w:type="spellStart"/>
                         <w:r>
                           <w:t>Calculation_Method</w:t>
                         </w:r>
+                        <w:proofErr w:type="spellEnd"/>
                       </w:p>
                     </w:tc>
                   </w:sdtContent>
                 </w:sdt>
                 <w:sdt>
                   <w:sdtPr>
-                    <w:id w:val="1940103643"/>
+                    <w:alias w:val="#Nav: /Management_Fee_Calc_Header/Management_Fee_Calc_Line/Calculation_Sub_Type"/>
+                    <w:tag w:val="#Nav: Management_Fee_Calculation/50119"/>
+                    <w:id w:val="-290745254"/>
                     <w:placeholder>
                       <w:docPart w:val="DefaultPlaceholder_-1854013440"/>
                     </w:placeholder>
-                    <w:dataBinding w:prefixMappings="xmlns:ns0='urn:microsoft-dynamics-businesscentral/internal/extended/reports/Management_Fee_Calculation/50119/' " w:xpath="/ns0:NavWordReportXmlPart[1]/ns0:Management_Fee_Calc_Header[1]/ns0:Management_Fee_Calc_Line[1]/ns0:Calculation_Sub_Type[1]" w:storeItemID="{F7209D94-4632-4C4E-B694-D48DD89A699E}"/>
+                    <w:dataBinding w:prefixMappings="xmlns:ns0='urn:microsoft-dynamics-nav/reports/Management_Fee_Calculation/50119/' " w:xpath="/ns0:NavWordReportXmlPart[1]/ns0:Management_Fee_Calc_Header[1]/ns0:Management_Fee_Calc_Line[1]/ns0:Calculation_Sub_Type[1]" w:storeItemID="{F525D34B-9F89-4FBE-9311-0F7E641D4220}"/>
                     <w:text/>
                   </w:sdtPr>
                   <w:sdtContent>
@@ -1063,20 +1109,24 @@
                         <w:vAlign w:val="center"/>
                       </w:tcPr>
                       <w:p>
+                        <w:proofErr w:type="spellStart"/>
                         <w:r>
                           <w:t>Calculation_Sub_Type</w:t>
                         </w:r>
+                        <w:proofErr w:type="spellEnd"/>
                       </w:p>
                     </w:tc>
                   </w:sdtContent>
                 </w:sdt>
                 <w:sdt>
                   <w:sdtPr>
-                    <w:id w:val="-1282721377"/>
+                    <w:alias w:val="#Nav: /Management_Fee_Calc_Header/Management_Fee_Calc_Line/Percentage_Type"/>
+                    <w:tag w:val="#Nav: Management_Fee_Calculation/50119"/>
+                    <w:id w:val="-1682033858"/>
                     <w:placeholder>
                       <w:docPart w:val="DefaultPlaceholder_-1854013440"/>
                     </w:placeholder>
-                    <w:dataBinding w:prefixMappings="xmlns:ns0='urn:microsoft-dynamics-businesscentral/internal/extended/reports/Management_Fee_Calculation/50119/' " w:xpath="/ns0:NavWordReportXmlPart[1]/ns0:Management_Fee_Calc_Header[1]/ns0:Management_Fee_Calc_Line[1]/ns0:Percentage_Type[1]" w:storeItemID="{F7209D94-4632-4C4E-B694-D48DD89A699E}"/>
+                    <w:dataBinding w:prefixMappings="xmlns:ns0='urn:microsoft-dynamics-nav/reports/Management_Fee_Calculation/50119/' " w:xpath="/ns0:NavWordReportXmlPart[1]/ns0:Management_Fee_Calc_Header[1]/ns0:Management_Fee_Calc_Line[1]/ns0:Percentage_Type[1]" w:storeItemID="{F525D34B-9F89-4FBE-9311-0F7E641D4220}"/>
                     <w:text/>
                   </w:sdtPr>
                   <w:sdtContent>
@@ -1086,20 +1136,24 @@
                         <w:vAlign w:val="center"/>
                       </w:tcPr>
                       <w:p>
+                        <w:proofErr w:type="spellStart"/>
                         <w:r>
                           <w:t>Percentage_Type</w:t>
                         </w:r>
+                        <w:proofErr w:type="spellEnd"/>
                       </w:p>
                     </w:tc>
                   </w:sdtContent>
                 </w:sdt>
                 <w:sdt>
                   <w:sdtPr>
-                    <w:id w:val="1579558482"/>
+                    <w:alias w:val="#Nav: /Management_Fee_Calc_Header/Management_Fee_Calc_Line/Percentage"/>
+                    <w:tag w:val="#Nav: Management_Fee_Calculation/50119"/>
+                    <w:id w:val="-751811823"/>
                     <w:placeholder>
                       <w:docPart w:val="DefaultPlaceholder_-1854013440"/>
                     </w:placeholder>
-                    <w:dataBinding w:prefixMappings="xmlns:ns0='urn:microsoft-dynamics-businesscentral/internal/extended/reports/Management_Fee_Calculation/50119/' " w:xpath="/ns0:NavWordReportXmlPart[1]/ns0:Management_Fee_Calc_Header[1]/ns0:Management_Fee_Calc_Line[1]/ns0:Percentage[1]" w:storeItemID="{F7209D94-4632-4C4E-B694-D48DD89A699E}"/>
+                    <w:dataBinding w:prefixMappings="xmlns:ns0='urn:microsoft-dynamics-nav/reports/Management_Fee_Calculation/50119/' " w:xpath="/ns0:NavWordReportXmlPart[1]/ns0:Management_Fee_Calc_Header[1]/ns0:Management_Fee_Calc_Line[1]/ns0:Percentage[1]" w:storeItemID="{F525D34B-9F89-4FBE-9311-0F7E641D4220}"/>
                     <w:text/>
                   </w:sdtPr>
                   <w:sdtContent>
@@ -1121,11 +1175,13 @@
                 </w:sdt>
                 <w:sdt>
                   <w:sdtPr>
-                    <w:id w:val="-1368513254"/>
+                    <w:alias w:val="#Nav: /Management_Fee_Calc_Header/Management_Fee_Calc_Line/Amount"/>
+                    <w:tag w:val="#Nav: Management_Fee_Calculation/50119"/>
+                    <w:id w:val="-283270767"/>
                     <w:placeholder>
                       <w:docPart w:val="DefaultPlaceholder_-1854013440"/>
                     </w:placeholder>
-                    <w:dataBinding w:prefixMappings="xmlns:ns0='urn:microsoft-dynamics-businesscentral/internal/extended/reports/Management_Fee_Calculation/50119/' " w:xpath="/ns0:NavWordReportXmlPart[1]/ns0:Management_Fee_Calc_Header[1]/ns0:Management_Fee_Calc_Line[1]/ns0:Amount[1]" w:storeItemID="{F7209D94-4632-4C4E-B694-D48DD89A699E}"/>
+                    <w:dataBinding w:prefixMappings="xmlns:ns0='urn:microsoft-dynamics-nav/reports/Management_Fee_Calculation/50119/' " w:xpath="/ns0:NavWordReportXmlPart[1]/ns0:Management_Fee_Calc_Header[1]/ns0:Management_Fee_Calc_Line[1]/ns0:Amount[1]" w:storeItemID="{F525D34B-9F89-4FBE-9311-0F7E641D4220}"/>
                     <w:text/>
                   </w:sdtPr>
                   <w:sdtContent>
@@ -1144,11 +1200,13 @@
                 </w:sdt>
                 <w:sdt>
                   <w:sdtPr>
-                    <w:id w:val="-62727859"/>
+                    <w:alias w:val="#Nav: /Management_Fee_Calc_Header/Management_Fee_Calc_Line/Base_Amount_Source"/>
+                    <w:tag w:val="#Nav: Management_Fee_Calculation/50119"/>
+                    <w:id w:val="1900475817"/>
                     <w:placeholder>
                       <w:docPart w:val="DefaultPlaceholder_-1854013440"/>
                     </w:placeholder>
-                    <w:dataBinding w:prefixMappings="xmlns:ns0='urn:microsoft-dynamics-businesscentral/internal/extended/reports/Management_Fee_Calculation/50119/' " w:xpath="/ns0:NavWordReportXmlPart[1]/ns0:Management_Fee_Calc_Header[1]/ns0:Management_Fee_Calc_Line[1]/ns0:Base_Amount_Source[1]" w:storeItemID="{F7209D94-4632-4C4E-B694-D48DD89A699E}"/>
+                    <w:dataBinding w:prefixMappings="xmlns:ns0='urn:microsoft-dynamics-nav/reports/Management_Fee_Calculation/50119/' " w:xpath="/ns0:NavWordReportXmlPart[1]/ns0:Management_Fee_Calc_Header[1]/ns0:Management_Fee_Calc_Line[1]/ns0:Base_Amount_Source[1]" w:storeItemID="{F525D34B-9F89-4FBE-9311-0F7E641D4220}"/>
                     <w:text/>
                   </w:sdtPr>
                   <w:sdtContent>
@@ -1158,20 +1216,24 @@
                         <w:vAlign w:val="center"/>
                       </w:tcPr>
                       <w:p>
+                        <w:proofErr w:type="spellStart"/>
                         <w:r>
                           <w:t>Base_Amount_Source</w:t>
                         </w:r>
+                        <w:proofErr w:type="spellEnd"/>
                       </w:p>
                     </w:tc>
                   </w:sdtContent>
                 </w:sdt>
                 <w:sdt>
                   <w:sdtPr>
-                    <w:id w:val="-782651886"/>
+                    <w:alias w:val="#Nav: /Management_Fee_Calc_Header/Management_Fee_Calc_Line/Base_Amount"/>
+                    <w:tag w:val="#Nav: Management_Fee_Calculation/50119"/>
+                    <w:id w:val="-702393775"/>
                     <w:placeholder>
                       <w:docPart w:val="DefaultPlaceholder_-1854013440"/>
                     </w:placeholder>
-                    <w:dataBinding w:prefixMappings="xmlns:ns0='urn:microsoft-dynamics-businesscentral/internal/extended/reports/Management_Fee_Calculation/50119/' " w:xpath="/ns0:NavWordReportXmlPart[1]/ns0:Management_Fee_Calc_Header[1]/ns0:Management_Fee_Calc_Line[1]/ns0:Base_Amount[1]" w:storeItemID="{F7209D94-4632-4C4E-B694-D48DD89A699E}"/>
+                    <w:dataBinding w:prefixMappings="xmlns:ns0='urn:microsoft-dynamics-nav/reports/Management_Fee_Calculation/50119/' " w:xpath="/ns0:NavWordReportXmlPart[1]/ns0:Management_Fee_Calc_Header[1]/ns0:Management_Fee_Calc_Line[1]/ns0:Base_Amount[1]" w:storeItemID="{F525D34B-9F89-4FBE-9311-0F7E641D4220}"/>
                     <w:text/>
                   </w:sdtPr>
                   <w:sdtContent>
@@ -1184,20 +1246,24 @@
                         <w:pPr>
                           <w:jc w:val="right"/>
                         </w:pPr>
+                        <w:proofErr w:type="spellStart"/>
                         <w:r>
                           <w:t>Base_Amount</w:t>
                         </w:r>
+                        <w:proofErr w:type="spellEnd"/>
                       </w:p>
                     </w:tc>
                   </w:sdtContent>
                 </w:sdt>
                 <w:sdt>
                   <w:sdtPr>
-                    <w:id w:val="1416596670"/>
+                    <w:alias w:val="#Nav: /Management_Fee_Calc_Header/Management_Fee_Calc_Line/Management_Fee"/>
+                    <w:tag w:val="#Nav: Management_Fee_Calculation/50119"/>
+                    <w:id w:val="-1841537813"/>
                     <w:placeholder>
                       <w:docPart w:val="DefaultPlaceholder_-1854013440"/>
                     </w:placeholder>
-                    <w:dataBinding w:prefixMappings="xmlns:ns0='urn:microsoft-dynamics-businesscentral/internal/extended/reports/Management_Fee_Calculation/50119/' " w:xpath="/ns0:NavWordReportXmlPart[1]/ns0:Management_Fee_Calc_Header[1]/ns0:Management_Fee_Calc_Line[1]/ns0:Management_Fee[1]" w:storeItemID="{F7209D94-4632-4C4E-B694-D48DD89A699E}"/>
+                    <w:dataBinding w:prefixMappings="xmlns:ns0='urn:microsoft-dynamics-nav/reports/Management_Fee_Calculation/50119/' " w:xpath="/ns0:NavWordReportXmlPart[1]/ns0:Management_Fee_Calc_Header[1]/ns0:Management_Fee_Calc_Line[1]/ns0:Management_Fee[1]" w:storeItemID="{F525D34B-9F89-4FBE-9311-0F7E641D4220}"/>
                     <w:text/>
                   </w:sdtPr>
                   <w:sdtContent>
@@ -1210,20 +1276,24 @@
                         <w:pPr>
                           <w:jc w:val="right"/>
                         </w:pPr>
+                        <w:proofErr w:type="spellStart"/>
                         <w:r>
                           <w:t>Management_Fee</w:t>
                         </w:r>
+                        <w:proofErr w:type="spellEnd"/>
                       </w:p>
                     </w:tc>
                   </w:sdtContent>
                 </w:sdt>
                 <w:sdt>
                   <w:sdtPr>
-                    <w:id w:val="1054199294"/>
+                    <w:alias w:val="#Nav: /Management_Fee_Calc_Header/Management_Fee_Calc_Line/Validity_Period"/>
+                    <w:tag w:val="#Nav: Management_Fee_Calculation/50119"/>
+                    <w:id w:val="-1298686556"/>
                     <w:placeholder>
                       <w:docPart w:val="DefaultPlaceholder_-1854013440"/>
                     </w:placeholder>
-                    <w:dataBinding w:prefixMappings="xmlns:ns0='urn:microsoft-dynamics-businesscentral/internal/extended/reports/Management_Fee_Calculation/50119/' " w:xpath="/ns0:NavWordReportXmlPart[1]/ns0:Management_Fee_Calc_Header[1]/ns0:Management_Fee_Calc_Line[1]/ns0:Validity_Period[1]" w:storeItemID="{F7209D94-4632-4C4E-B694-D48DD89A699E}"/>
+                    <w:dataBinding w:prefixMappings="xmlns:ns0='urn:microsoft-dynamics-nav/reports/Management_Fee_Calculation/50119/' " w:xpath="/ns0:NavWordReportXmlPart[1]/ns0:Management_Fee_Calc_Header[1]/ns0:Management_Fee_Calc_Line[1]/ns0:Validity_Period[1]" w:storeItemID="{F525D34B-9F89-4FBE-9311-0F7E641D4220}"/>
                     <w:text/>
                   </w:sdtPr>
                   <w:sdtContent>
@@ -1233,20 +1303,24 @@
                         <w:vAlign w:val="center"/>
                       </w:tcPr>
                       <w:p>
+                        <w:proofErr w:type="spellStart"/>
                         <w:r>
                           <w:t>Validity_Period</w:t>
                         </w:r>
+                        <w:proofErr w:type="spellEnd"/>
                       </w:p>
                     </w:tc>
                   </w:sdtContent>
                 </w:sdt>
                 <w:sdt>
                   <w:sdtPr>
-                    <w:id w:val="-1110504675"/>
+                    <w:alias w:val="#Nav: /Management_Fee_Calc_Header/Management_Fee_Calc_Line/Contract_Status"/>
+                    <w:tag w:val="#Nav: Management_Fee_Calculation/50119"/>
+                    <w:id w:val="1888210791"/>
                     <w:placeholder>
                       <w:docPart w:val="DefaultPlaceholder_-1854013440"/>
                     </w:placeholder>
-                    <w:dataBinding w:prefixMappings="xmlns:ns0='urn:microsoft-dynamics-businesscentral/internal/extended/reports/Management_Fee_Calculation/50119/' " w:xpath="/ns0:NavWordReportXmlPart[1]/ns0:Management_Fee_Calc_Header[1]/ns0:Management_Fee_Calc_Line[1]/ns0:Contract_Status[1]" w:storeItemID="{F7209D94-4632-4C4E-B694-D48DD89A699E}"/>
+                    <w:dataBinding w:prefixMappings="xmlns:ns0='urn:microsoft-dynamics-nav/reports/Management_Fee_Calculation/50119/' " w:xpath="/ns0:NavWordReportXmlPart[1]/ns0:Management_Fee_Calc_Header[1]/ns0:Management_Fee_Calc_Line[1]/ns0:Contract_Status[1]" w:storeItemID="{F525D34B-9F89-4FBE-9311-0F7E641D4220}"/>
                     <w:text/>
                   </w:sdtPr>
                   <w:sdtContent>
@@ -1256,9 +1330,11 @@
                         <w:vAlign w:val="center"/>
                       </w:tcPr>
                       <w:p>
+                        <w:proofErr w:type="spellStart"/>
                         <w:r>
                           <w:t>Contract_Status</w:t>
                         </w:r>
+                        <w:proofErr w:type="spellEnd"/>
                       </w:p>
                     </w:tc>
                   </w:sdtContent>
@@ -1357,14 +1433,14 @@
               <w:b/>
               <w:bCs/>
             </w:rPr>
-            <w:id w:val="1871950829"/>
+            <w:alias w:val="#Nav: /Management_Fee_Calc_Header/Total_Management_Fee"/>
+            <w:tag w:val="#Nav: Management_Fee_Calculation/50119"/>
+            <w:id w:val="419234094"/>
             <w:placeholder>
               <w:docPart w:val="DefaultPlaceholder_-1854013440"/>
             </w:placeholder>
             <w:dataBinding w:prefixMappings="xmlns:ns0='urn:microsoft-dynamics-nav/reports/Management_Fee_Calculation/50119/' " w:xpath="/ns0:NavWordReportXmlPart[1]/ns0:Management_Fee_Calc_Header[1]/ns0:Total_Management_Fee[1]" w:storeItemID="{F525D34B-9F89-4FBE-9311-0F7E641D4220}"/>
             <w:text/>
-            <w:alias w:val="#Nav: /Management_Fee_Calc_Header/Total_Management_Fee"/>
-            <w:tag w:val="#Nav: Management_Fee_Calculation/50119"/>
           </w:sdtPr>
           <w:sdtContent>
             <w:tc>
@@ -1380,6 +1456,7 @@
                     <w:bCs/>
                   </w:rPr>
                 </w:pPr>
+                <w:proofErr w:type="spellStart"/>
                 <w:r>
                   <w:rPr>
                     <w:b/>
@@ -1387,6 +1464,7 @@
                   </w:rPr>
                   <w:t>Total_Management_Fee</w:t>
                 </w:r>
+                <w:proofErr w:type="spellEnd"/>
               </w:p>
             </w:tc>
           </w:sdtContent>
@@ -1584,7 +1662,7 @@
         <w:sz w:val="20"/>
         <w:szCs w:val="20"/>
       </w:rPr>
-      <w:ptab w:alignment="center" w:relativeTo="margin" w:leader="none"/>
+      <w:ptab w:relativeTo="margin" w:alignment="center" w:leader="none"/>
     </w:r>
     <w:r>
       <w:rPr>
@@ -1592,7 +1670,7 @@
         <w:sz w:val="20"/>
         <w:szCs w:val="20"/>
       </w:rPr>
-      <w:ptab w:alignment="right" w:relativeTo="margin" w:leader="none"/>
+      <w:ptab w:relativeTo="margin" w:alignment="right" w:leader="none"/>
     </w:r>
   </w:p>
 </w:ftr>
@@ -2253,93 +2331,6 @@
     </w:docPart>
     <w:docPart>
       <w:docPartPr>
-        <w:name w:val="038AF384FC704000903F580644033573"/>
-        <w:category>
-          <w:name w:val="General"/>
-          <w:gallery w:val="placeholder"/>
-        </w:category>
-        <w:types>
-          <w:type w:val="bbPlcHdr"/>
-        </w:types>
-        <w:behaviors>
-          <w:behavior w:val="content"/>
-        </w:behaviors>
-        <w:guid w:val="{08622EDE-F996-4523-AEE7-46F8E166D018}"/>
-      </w:docPartPr>
-      <w:docPartBody>
-        <w:p>
-          <w:pPr>
-            <w:pStyle w:val="038AF384FC704000903F580644033573"/>
-          </w:pPr>
-          <w:r>
-            <w:rPr>
-              <w:rStyle w:val="PlaceholderText"/>
-            </w:rPr>
-            <w:t>Click or tap here to enter text.</w:t>
-          </w:r>
-        </w:p>
-      </w:docPartBody>
-    </w:docPart>
-    <w:docPart>
-      <w:docPartPr>
-        <w:name w:val="CF45DAA9D5F549DAA360542D058A64D5"/>
-        <w:category>
-          <w:name w:val="General"/>
-          <w:gallery w:val="placeholder"/>
-        </w:category>
-        <w:types>
-          <w:type w:val="bbPlcHdr"/>
-        </w:types>
-        <w:behaviors>
-          <w:behavior w:val="content"/>
-        </w:behaviors>
-        <w:guid w:val="{C4CA5C8D-7A49-407D-BA7B-2A7FBE001B1D}"/>
-      </w:docPartPr>
-      <w:docPartBody>
-        <w:p>
-          <w:pPr>
-            <w:pStyle w:val="CF45DAA9D5F549DAA360542D058A64D5"/>
-          </w:pPr>
-          <w:r>
-            <w:rPr>
-              <w:rStyle w:val="PlaceholderText"/>
-            </w:rPr>
-            <w:t>Click or tap here to enter text.</w:t>
-          </w:r>
-        </w:p>
-      </w:docPartBody>
-    </w:docPart>
-    <w:docPart>
-      <w:docPartPr>
-        <w:name w:val="84FE0A378D7E4B67B305160FC405DE9F"/>
-        <w:category>
-          <w:name w:val="General"/>
-          <w:gallery w:val="placeholder"/>
-        </w:category>
-        <w:types>
-          <w:type w:val="bbPlcHdr"/>
-        </w:types>
-        <w:behaviors>
-          <w:behavior w:val="content"/>
-        </w:behaviors>
-        <w:guid w:val="{A989FE4E-4E09-4938-8800-8372BB0E5705}"/>
-      </w:docPartPr>
-      <w:docPartBody>
-        <w:p>
-          <w:pPr>
-            <w:pStyle w:val="84FE0A378D7E4B67B305160FC405DE9F"/>
-          </w:pPr>
-          <w:r>
-            <w:rPr>
-              <w:rStyle w:val="PlaceholderText"/>
-            </w:rPr>
-            <w:t>Click or tap here to enter text.</w:t>
-          </w:r>
-        </w:p>
-      </w:docPartBody>
-    </w:docPart>
-    <w:docPart>
-      <w:docPartPr>
         <w:name w:val="DefaultPlaceholder_-1854013435"/>
         <w:category>
           <w:name w:val="General"/>
@@ -2430,13 +2421,19 @@
   <w:rsids>
     <w:rsidRoot w:val="004353A3"/>
     <w:rsid w:val="0011364E"/>
+    <w:rsid w:val="00205DAD"/>
     <w:rsid w:val="003A7BED"/>
+    <w:rsid w:val="003B7CCB"/>
     <w:rsid w:val="004353A3"/>
+    <w:rsid w:val="004405F4"/>
     <w:rsid w:val="00645093"/>
     <w:rsid w:val="006B1911"/>
+    <w:rsid w:val="007F5399"/>
     <w:rsid w:val="0099227A"/>
     <w:rsid w:val="00B75954"/>
+    <w:rsid w:val="00D057BD"/>
     <w:rsid w:val="00D35555"/>
+    <w:rsid w:val="00D84470"/>
   </w:rsids>
   <m:mathPr>
     <m:mathFont m:val="Cambria Math"/>
@@ -2897,18 +2894,6 @@
       <w:color w:val="666666"/>
     </w:rPr>
   </w:style>
-  <w:style w:type="paragraph" w:customStyle="1" w:styleId="038AF384FC704000903F580644033573">
-    <w:name w:val="038AF384FC704000903F580644033573"/>
-    <w:rsid w:val="004353A3"/>
-  </w:style>
-  <w:style w:type="paragraph" w:customStyle="1" w:styleId="CF45DAA9D5F549DAA360542D058A64D5">
-    <w:name w:val="CF45DAA9D5F549DAA360542D058A64D5"/>
-    <w:rsid w:val="004353A3"/>
-  </w:style>
-  <w:style w:type="paragraph" w:customStyle="1" w:styleId="84FE0A378D7E4B67B305160FC405DE9F">
-    <w:name w:val="84FE0A378D7E4B67B305160FC405DE9F"/>
-    <w:rsid w:val="004353A3"/>
-  </w:style>
 </w:styles>
 </file>
 
@@ -3214,254 +3199,254 @@
 </a:theme>
 </file>
 
-<file path=customXml/item1.xml><?xml version="1.0" encoding="utf-8"?>
+<file path=customXml/item1.xml>��< ? x m l   v e r s i o n = " 1 . 0 "   e n c o d i n g = " u t f - 1 6 " ? > < N a v W o r d R e p o r t X m l P a r t   x m l n s = " u r n : m i c r o s o f t - d y n a m i c s - n a v / r e p o r t s / M a n a g e m e n t _ F e e _ C a l c u l a t i o n / 5 0 1 1 9 / " > + 
+     < B C R e p o r t I n f o r m a t i o n > + 
+         < R e p o r t M e t a d a t a > + 
+             < E x t e n s i o n I d > E x t e n s i o n   I D < / E x t e n s i o n I d > + 
+             < E x t e n s i o n N a m e > E x t e n s i o n   N a m e < / E x t e n s i o n N a m e > + 
+             < E x t e n s i o n P u b l i s h e r > E x t e n s i o n   P u b l i s h e r < / E x t e n s i o n P u b l i s h e r > + 
+             < E x t e n s i o n V e r s i o n > E x t e n s i o n   V e r s i o n < / E x t e n s i o n V e r s i o n > + 
+             < R e p o r t I d > R e p o r t   I D < / R e p o r t I d > + 
+             < R e p o r t N a m e > R e p o r t   N a m e < / R e p o r t N a m e > + 
+             < A b o u t T h i s R e p o r t T i t l e > A b o u t   T h i s   R e p o r t   T i t l e < / A b o u t T h i s R e p o r t T i t l e > + 
+             < A b o u t T h i s R e p o r t T e x t > A b o u t   T h i s   R e p o r t   T e x t < / A b o u t T h i s R e p o r t T e x t > + 
+             < R e p o r t H e l p L i n k > R e p o r t   H e l p   L i n k < / R e p o r t H e l p L i n k > + 
+         < / R e p o r t M e t a d a t a > + 
+         < R e p o r t R e q u e s t > + 
+             < T e n a n t E n t r a I d > T e n a n t   E n t r a   I d < / T e n a n t E n t r a I d > + 
+             < E n v i r o n m e n t N a m e > E n v i r o n m e n t   N a m e < / E n v i r o n m e n t N a m e > + 
+             < E n v i r o n m e n t T y p e > E n v i r o n m e n t   T y p e < / E n v i r o n m e n t T y p e > + 
+             < C o m p a n y N a m e > C o m p a n y   N a m e < / C o m p a n y N a m e > + 
+             < C o m p a n y D i s p l a y N a m e > C o m p a n y   D i s p l a y   N a m e < / C o m p a n y D i s p l a y N a m e > + 
+             < C o m p a n y I d > C o m p a n y   I D < / C o m p a n y I d > + 
+             < U s e r N a m e > U s e r   N a m e < / U s e r N a m e > + 
+             < D a t e A n d T i m e > D a t e   a n d   T i m e < / D a t e A n d T i m e > + 
+             < L a n g u a g e > L a n g u a g e < / L a n g u a g e > + 
+             < F o r m a t R e g i o n > F o r m a t   R e g i o n < / F o r m a t R e g i o n > + 
+             < D a t e T i m e V a l u e s > + 
+                 < Y e a r > Y e a r < / Y e a r > + 
+                 < M o n t h N u m b e r > M o n t h   N u m b e r < / M o n t h N u m b e r > + 
+                 < D a y N u m b e r > D a y   N u m b e r < / D a y N u m b e r > + 
+                 < H o u r > H o u r < / H o u r > + 
+                 < M i n u t e > M i n u t e < / M i n u t e > + 
+             < / D a t e T i m e V a l u e s > + 
+         < / R e p o r t R e q u e s t > + 
+     < / B C R e p o r t I n f o r m a t i o n > + 
+     < M a n a g e m e n t _ F e e _ C a l c _ H e a d e r > + 
+         < F i n a n c i a l _ Y e a r > F i n a n c i a l _ Y e a r < / F i n a n c i a l _ Y e a r > + 
+         < O w n e r _ N a m e > O w n e r _ N a m e < / O w n e r _ N a m e > + 
+         < P e r i o d _ F r o m > P e r i o d _ F r o m < / P e r i o d _ F r o m > + 
+         < P e r i o d _ T o > P e r i o d _ T o < / P e r i o d _ T o > + 
+         < P r o p e r t y > P r o p e r t y < / P r o p e r t y > + 
+         < R e p o r t _ D a t e > R e p o r t _ D a t e < / R e p o r t _ D a t e > + 
+         < T o t a l _ M a n a g e m e n t _ F e e > T o t a l _ M a n a g e m e n t _ F e e < / T o t a l _ M a n a g e m e n t _ F e e > + 
+         < M a n a g e m e n t _ F e e _ C a l c _ L i n e > + 
+             < A m o u n t > A m o u n t < / A m o u n t > + 
+             < B a s e _ A m o u n t > B a s e _ A m o u n t < / B a s e _ A m o u n t > + 
+             < B a s e _ A m o u n t _ S o u r c e > B a s e _ A m o u n t _ S o u r c e < / B a s e _ A m o u n t _ S o u r c e > + 
+             < C a l c u l a t i o n _ M e t h o d > C a l c u l a t i o n _ M e t h o d < / C a l c u l a t i o n _ M e t h o d > + 
+             < C a l c u l a t i o n _ S u b _ T y p e > C a l c u l a t i o n _ S u b _ T y p e < / C a l c u l a t i o n _ S u b _ T y p e > + 
+             < C o m p a n y _ O w n e r _ N a m e > C o m p a n y _ O w n e r _ N a m e < / C o m p a n y _ O w n e r _ N a m e > + 
+             < C o n t r a c t _ S t a t u s > C o n t r a c t _ S t a t u s < / C o n t r a c t _ S t a t u s > + 
+             < M a n a g e m e n t _ F e e > M a n a g e m e n t _ F e e < / M a n a g e m e n t _ F e e > + 
+             < P e r c e n t a g e > P e r c e n t a g e < / P e r c e n t a g e > + 
+             < P e r c e n t a g e _ T y p e > P e r c e n t a g e _ T y p e < / P e r c e n t a g e _ T y p e > + 
+             < P r o p e r t y _ M a n a g e m e n t _ C o m p a n y > P r o p e r t y _ M a n a g e m e n t _ C o m p a n y < / P r o p e r t y _ M a n a g e m e n t _ C o m p a n y > + 
+             < P r o p e r t y _ N a m e > P r o p e r t y _ N a m e < / P r o p e r t y _ N a m e > + 
+             < P r o p e r t y _ T y p e > P r o p e r t y _ T y p e < / P r o p e r t y _ T y p e > + 
+             < V a l i d i t y _ P e r i o d > V a l i d i t y _ P e r i o d < / V a l i d i t y _ P e r i o d > + 
+         < / M a n a g e m e n t _ F e e _ C a l c _ L i n e > + 
+     < / M a n a g e m e n t _ F e e _ C a l c _ H e a d e r > + 
+ < / N a v W o r d R e p o r t X m l P a r t > 
+</file>
+
+<file path=customXml/item2.xml>��< ? x m l   v e r s i o n = " 1 . 0 "   e n c o d i n g = " u t f - 1 6 " ? > < N a v W o r d R e p o r t X m l P a r t   x m l n s = " u r n : m i c r o s o f t - d y n a m i c s - b u s i n e s s c e n t r a l / i n t e r n a l / e x t e n d e d / r e p o r t s / M a n a g e m e n t _ F e e _ C a l c u l a t i o n / 5 0 1 1 9 / " > + 
+     < B C R e p o r t I n f o r m a t i o n > + 
+         < R e p o r t M e t a d a t a > + 
+             < E x t e n s i o n I d > E x t e n s i o n   I D < / E x t e n s i o n I d > + 
+             < E x t e n s i o n N a m e > E x t e n s i o n   N a m e < / E x t e n s i o n N a m e > + 
+             < E x t e n s i o n P u b l i s h e r > E x t e n s i o n   P u b l i s h e r < / E x t e n s i o n P u b l i s h e r > + 
+             < E x t e n s i o n V e r s i o n > E x t e n s i o n   V e r s i o n < / E x t e n s i o n V e r s i o n > + 
+             < R e p o r t I d > R e p o r t   I D < / R e p o r t I d > + 
+             < R e p o r t N a m e > R e p o r t   N a m e < / R e p o r t N a m e > + 
+             < A b o u t T h i s R e p o r t T i t l e > A b o u t   T h i s   R e p o r t   T i t l e < / A b o u t T h i s R e p o r t T i t l e > + 
+             < A b o u t T h i s R e p o r t T e x t > A b o u t   T h i s   R e p o r t   T e x t < / A b o u t T h i s R e p o r t T e x t > + 
+             < R e p o r t H e l p L i n k > R e p o r t   H e l p   L i n k < / R e p o r t H e l p L i n k > + 
+         < / R e p o r t M e t a d a t a > + 
+         < R e p o r t R e q u e s t > + 
+             < T e n a n t E n t r a I d > T e n a n t   E n t r a   I d < / T e n a n t E n t r a I d > + 
+             < E n v i r o n m e n t N a m e > E n v i r o n m e n t   N a m e < / E n v i r o n m e n t N a m e > + 
+             < E n v i r o n m e n t T y p e > E n v i r o n m e n t   T y p e < / E n v i r o n m e n t T y p e > + 
+             < C o m p a n y N a m e > C o m p a n y   N a m e < / C o m p a n y N a m e > + 
+             < C o m p a n y D i s p l a y N a m e > C o m p a n y   D i s p l a y   N a m e < / C o m p a n y D i s p l a y N a m e > + 
+             < C o m p a n y I d > C o m p a n y   I D < / C o m p a n y I d > + 
+             < U s e r N a m e > U s e r   N a m e < / U s e r N a m e > + 
+             < D a t e A n d T i m e > D a t e   a n d   T i m e < / D a t e A n d T i m e > + 
+             < L a n g u a g e > L a n g u a g e < / L a n g u a g e > + 
+             < F o r m a t R e g i o n > F o r m a t   R e g i o n < / F o r m a t R e g i o n > + 
+             < D a t e T i m e V a l u e s > + 
+                 < Y e a r > Y e a r < / Y e a r > + 
+                 < M o n t h N u m b e r > M o n t h   N u m b e r < / M o n t h N u m b e r > + 
+                 < D a y N u m b e r > D a y   N u m b e r < / D a y N u m b e r > + 
+                 < H o u r > H o u r < / H o u r > + 
+                 < M i n u t e > M i n u t e < / M i n u t e > + 
+             < / D a t e T i m e V a l u e s > + 
+         < / R e p o r t R e q u e s t > + 
+     < / B C R e p o r t I n f o r m a t i o n > + 
+     < T o o l t i p s / > + 
+     < M a n a g e m e n t _ F e e _ C a l c _ H e a d e r   E l e m e n t T y p e = " D a t a I t e m "   E l e m e n t I d = " 1 4 7 8 3 1 3 7 4 7 " > + 
+         < F i n a n c i a l _ Y e a r   E l e m e n t T y p e = " C o l u m n "   E l e m e n t I d = " 6 1 2 1 1 5 9 0 8 "   D a t a T y p e = " I n t e g e r " > F i n a n c i a l _ Y e a r < / F i n a n c i a l _ Y e a r > + 
+         < O w n e r _ N a m e   E l e m e n t T y p e = " C o l u m n "   E l e m e n t I d = " 1 3 5 5 2 3 0 7 8 0 "   D a t a T y p e = " T e x t " > O w n e r _ N a m e < / O w n e r _ N a m e > + 
+         < P e r i o d _ F r o m   E l e m e n t T y p e = " C o l u m n "   E l e m e n t I d = " 5 4 5 9 3 1 6 0 7 "   D a t a T y p e = " D a t e " > P e r i o d _ F r o m < / P e r i o d _ F r o m > + 
+         < P e r i o d _ T o   E l e m e n t T y p e = " C o l u m n "   E l e m e n t I d = " 4 3 2 5 1 1 5 9 6 "   D a t a T y p e = " D a t e " > P e r i o d _ T o < / P e r i o d _ T o > + 
+         < P r o p e r t y   E l e m e n t T y p e = " C o l u m n "   E l e m e n t I d = " 1 8 0 5 8 9 6 7 0 "   D a t a T y p e = " T e x t " > P r o p e r t y < / P r o p e r t y > + 
+         < R e p o r t _ D a t e   E l e m e n t T y p e = " C o l u m n "   E l e m e n t I d = " 2 1 0 3 3 2 7 2 0 "   D a t a T y p e = " D a t e " > R e p o r t _ D a t e < / R e p o r t _ D a t e > + 
+         < T o t a l _ M a n a g e m e n t _ F e e   E l e m e n t T y p e = " C o l u m n "   E l e m e n t I d = " 1 0 8 4 7 4 0 8 3 4 "   D a t a T y p e = " D e c i m a l " > T o t a l _ M a n a g e m e n t _ F e e < / T o t a l _ M a n a g e m e n t _ F e e > + 
+         < M a n a g e m e n t _ F e e _ C a l c _ L i n e   E l e m e n t T y p e = " D a t a I t e m "   E l e m e n t I d = " 8 7 9 9 9 6 9 4 8 " > + 
+             < A m o u n t   E l e m e n t T y p e = " C o l u m n "   E l e m e n t I d = " 1 5 1 1 0 9 1 2 7 1 "   D a t a T y p e = " D e c i m a l " > A m o u n t < / A m o u n t > + 
+             < B a s e _ A m o u n t   E l e m e n t T y p e = " C o l u m n "   E l e m e n t I d = " 8 9 0 0 3 8 4 7 5 "   D a t a T y p e = " D e c i m a l " > B a s e _ A m o u n t < / B a s e _ A m o u n t > + 
+             < B a s e _ A m o u n t _ S o u r c e   E l e m e n t T y p e = " C o l u m n "   E l e m e n t I d = " 8 5 1 3 1 2 0 5 7 "   D a t a T y p e = " O p t i o n " > B a s e _ A m o u n t _ S o u r c e < / B a s e _ A m o u n t _ S o u r c e > + 
+             < C a l c u l a t i o n _ M e t h o d   E l e m e n t T y p e = " C o l u m n "   E l e m e n t I d = " 5 5 3 6 6 7 0 1 2 "   D a t a T y p e = " O p t i o n " > C a l c u l a t i o n _ M e t h o d < / C a l c u l a t i o n _ M e t h o d > + 
+             < C a l c u l a t i o n _ S u b _ T y p e   E l e m e n t T y p e = " C o l u m n "   E l e m e n t I d = " 1 3 7 0 5 5 6 6 2 4 "   D a t a T y p e = " O p t i o n " > C a l c u l a t i o n _ S u b _ T y p e < / C a l c u l a t i o n _ S u b _ T y p e > + 
+             < C o m p a n y _ O w n e r _ N a m e   E l e m e n t T y p e = " C o l u m n "   E l e m e n t I d = " 1 4 4 0 9 4 1 0 4 4 "   D a t a T y p e = " T e x t " > C o m p a n y _ O w n e r _ N a m e < / C o m p a n y _ O w n e r _ N a m e > + 
+             < C o n t r a c t _ S t a t u s   E l e m e n t T y p e = " C o l u m n "   E l e m e n t I d = " 2 0 1 6 9 0 4 2 7 6 "   D a t a T y p e = " O p t i o n " > C o n t r a c t _ S t a t u s < / C o n t r a c t _ S t a t u s > + 
+             < M a n a g e m e n t _ F e e   E l e m e n t T y p e = " C o l u m n "   E l e m e n t I d = " 1 1 4 3 6 1 4 9 6 7 "   D a t a T y p e = " D e c i m a l " > M a n a g e m e n t _ F e e < / M a n a g e m e n t _ F e e > + 
+             < P e r c e n t a g e   E l e m e n t T y p e = " C o l u m n "   E l e m e n t I d = " 1 4 1 0 1 8 0 5 7 3 "   D a t a T y p e = " I n t e g e r " > P e r c e n t a g e < / P e r c e n t a g e > + 
+             < P e r c e n t a g e _ T y p e   E l e m e n t T y p e = " C o l u m n "   E l e m e n t I d = " 5 5 7 7 2 5 7 3 4 "   D a t a T y p e = " O p t i o n " > P e r c e n t a g e _ T y p e < / P e r c e n t a g e _ T y p e > + 
+             < P r o p e r t y _ M a n a g e m e n t _ C o m p a n y   E l e m e n t T y p e = " C o l u m n "   E l e m e n t I d = " 2 0 4 6 3 5 0 8 2 "   D a t a T y p e = " T e x t " > P r o p e r t y _ M a n a g e m e n t _ C o m p a n y < / P r o p e r t y _ M a n a g e m e n t _ C o m p a n y > + 
+             < P r o p e r t y _ N a m e   E l e m e n t T y p e = " C o l u m n "   E l e m e n t I d = " 1 2 9 1 8 2 3 7 9 8 "   D a t a T y p e = " T e x t " > P r o p e r t y _ N a m e < / P r o p e r t y _ N a m e > + 
+             < P r o p e r t y _ T y p e   E l e m e n t T y p e = " C o l u m n "   E l e m e n t I d = " 1 2 4 5 0 9 6 0 7 5 "   D a t a T y p e = " T e x t " > P r o p e r t y _ T y p e < / P r o p e r t y _ T y p e > + 
+             < V a l i d i t y _ P e r i o d   E l e m e n t T y p e = " C o l u m n "   E l e m e n t I d = " 1 0 6 3 4 8 5 8 4 3 "   D a t a T y p e = " T e x t " > V a l i d i t y _ P e r i o d < / V a l i d i t y _ P e r i o d > + 
+         < / M a n a g e m e n t _ F e e _ C a l c _ L i n e > + 
+     < / M a n a g e m e n t _ F e e _ C a l c _ H e a d e r > + 
+ < / N a v W o r d R e p o r t X m l P a r t > 
+</file>
+
+<file path=customXml/item3.xml><?xml version="1.0" encoding="utf-8"?>
 <b:Sources xmlns:b="http://schemas.openxmlformats.org/officeDocument/2006/bibliography" xmlns="http://schemas.openxmlformats.org/officeDocument/2006/bibliography" SelectedStyle="\APASixthEditionOfficeOnline.xsl" StyleName="APA" Version="6"/>
 </file>
 
-<file path=customXml/item2.xml>��< ? x m l   v e r s i o n = " 1 . 0 "   e n c o d i n g = " u t f - 1 6 " ? > < N a v W o r d R e p o r t X m l P a r t   x m l n s = " u r n : m i c r o s o f t - d y n a m i c s - b u s i n e s s c e n t r a l / i n t e r n a l / e x t e n d e d / r e p o r t s / M a n a g e m e n t _ F e e _ C a l c u l a t i o n / 5 0 1 1 9 / " > - 
-     < B C R e p o r t I n f o r m a t i o n > - 
-         < R e p o r t M e t a d a t a > - 
-             < E x t e n s i o n I d > E x t e n s i o n   I D < / E x t e n s i o n I d > - 
-             < E x t e n s i o n N a m e > E x t e n s i o n   N a m e < / E x t e n s i o n N a m e > - 
-             < E x t e n s i o n P u b l i s h e r > E x t e n s i o n   P u b l i s h e r < / E x t e n s i o n P u b l i s h e r > - 
-             < E x t e n s i o n V e r s i o n > E x t e n s i o n   V e r s i o n < / E x t e n s i o n V e r s i o n > - 
-             < R e p o r t I d > R e p o r t   I D < / R e p o r t I d > - 
-             < R e p o r t N a m e > R e p o r t   N a m e < / R e p o r t N a m e > - 
-             < A b o u t T h i s R e p o r t T i t l e > A b o u t   T h i s   R e p o r t   T i t l e < / A b o u t T h i s R e p o r t T i t l e > - 
-             < A b o u t T h i s R e p o r t T e x t > A b o u t   T h i s   R e p o r t   T e x t < / A b o u t T h i s R e p o r t T e x t > - 
-             < R e p o r t H e l p L i n k > R e p o r t   H e l p   L i n k < / R e p o r t H e l p L i n k > - 
-         < / R e p o r t M e t a d a t a > - 
-         < R e p o r t R e q u e s t > - 
-             < T e n a n t E n t r a I d > T e n a n t   E n t r a   I d < / T e n a n t E n t r a I d > - 
-             < E n v i r o n m e n t N a m e > E n v i r o n m e n t   N a m e < / E n v i r o n m e n t N a m e > - 
-             < E n v i r o n m e n t T y p e > E n v i r o n m e n t   T y p e < / E n v i r o n m e n t T y p e > - 
-             < C o m p a n y N a m e > C o m p a n y   N a m e < / C o m p a n y N a m e > - 
-             < C o m p a n y D i s p l a y N a m e > C o m p a n y   D i s p l a y   N a m e < / C o m p a n y D i s p l a y N a m e > - 
-             < C o m p a n y I d > C o m p a n y   I D < / C o m p a n y I d > - 
-             < U s e r N a m e > U s e r   N a m e < / U s e r N a m e > - 
-             < D a t e A n d T i m e > D a t e   a n d   T i m e < / D a t e A n d T i m e > - 
-             < L a n g u a g e > L a n g u a g e < / L a n g u a g e > - 
-             < F o r m a t R e g i o n > F o r m a t   R e g i o n < / F o r m a t R e g i o n > - 
-             < D a t e T i m e V a l u e s > - 
-                 < Y e a r > Y e a r < / Y e a r > - 
-                 < M o n t h N u m b e r > M o n t h   N u m b e r < / M o n t h N u m b e r > - 
-                 < D a y N u m b e r > D a y   N u m b e r < / D a y N u m b e r > - 
-                 < H o u r > H o u r < / H o u r > - 
-                 < M i n u t e > M i n u t e < / M i n u t e > - 
-             < / D a t e T i m e V a l u e s > - 
-         < / R e p o r t R e q u e s t > - 
-     < / B C R e p o r t I n f o r m a t i o n > - 
-     < T o o l t i p s / > - 
-     < M a n a g e m e n t _ F e e _ C a l c _ H e a d e r   E l e m e n t T y p e = " D a t a I t e m "   E l e m e n t I d = " 1 4 7 8 3 1 3 7 4 7 " > - 
-         < F i n a n c i a l _ Y e a r   E l e m e n t T y p e = " C o l u m n "   E l e m e n t I d = " 6 1 2 1 1 5 9 0 8 "   D a t a T y p e = " I n t e g e r " > F i n a n c i a l _ Y e a r < / F i n a n c i a l _ Y e a r > - 
-         < O w n e r _ N a m e   E l e m e n t T y p e = " C o l u m n "   E l e m e n t I d = " 1 3 5 5 2 3 0 7 8 0 "   D a t a T y p e = " T e x t " > O w n e r _ N a m e < / O w n e r _ N a m e > - 
-         < P e r i o d _ F r o m   E l e m e n t T y p e = " C o l u m n "   E l e m e n t I d = " 5 4 5 9 3 1 6 0 7 "   D a t a T y p e = " D a t e " > P e r i o d _ F r o m < / P e r i o d _ F r o m > - 
-         < P e r i o d _ T o   E l e m e n t T y p e = " C o l u m n "   E l e m e n t I d = " 4 3 2 5 1 1 5 9 6 "   D a t a T y p e = " D a t e " > P e r i o d _ T o < / P e r i o d _ T o > - 
-         < P r o p e r t y   E l e m e n t T y p e = " C o l u m n "   E l e m e n t I d = " 1 8 0 5 8 9 6 7 0 "   D a t a T y p e = " T e x t " > P r o p e r t y < / P r o p e r t y > - 
-         < R e p o r t _ D a t e   E l e m e n t T y p e = " C o l u m n "   E l e m e n t I d = " 2 1 0 3 3 2 7 2 0 "   D a t a T y p e = " D a t e " > R e p o r t _ D a t e < / R e p o r t _ D a t e > - 
-         < T o t a l _ M a n a g e m e n t _ F e e   E l e m e n t T y p e = " C o l u m n "   E l e m e n t I d = " 1 0 8 4 7 4 0 8 3 4 "   D a t a T y p e = " D e c i m a l " > T o t a l _ M a n a g e m e n t _ F e e < / T o t a l _ M a n a g e m e n t _ F e e > - 
-         < M a n a g e m e n t _ F e e _ C a l c _ L i n e   E l e m e n t T y p e = " D a t a I t e m "   E l e m e n t I d = " 8 7 9 9 9 6 9 4 8 " > - 
-             < A m o u n t   E l e m e n t T y p e = " C o l u m n "   E l e m e n t I d = " 1 5 1 1 0 9 1 2 7 1 "   D a t a T y p e = " D e c i m a l " > A m o u n t < / A m o u n t > - 
-             < B a s e _ A m o u n t   E l e m e n t T y p e = " C o l u m n "   E l e m e n t I d = " 8 9 0 0 3 8 4 7 5 "   D a t a T y p e = " D e c i m a l " > B a s e _ A m o u n t < / B a s e _ A m o u n t > - 
-             < B a s e _ A m o u n t _ S o u r c e   E l e m e n t T y p e = " C o l u m n "   E l e m e n t I d = " 8 5 1 3 1 2 0 5 7 "   D a t a T y p e = " O p t i o n " > B a s e _ A m o u n t _ S o u r c e < / B a s e _ A m o u n t _ S o u r c e > - 
-             < C a l c u l a t i o n _ M e t h o d   E l e m e n t T y p e = " C o l u m n "   E l e m e n t I d = " 5 5 3 6 6 7 0 1 2 "   D a t a T y p e = " O p t i o n " > C a l c u l a t i o n _ M e t h o d < / C a l c u l a t i o n _ M e t h o d > - 
-             < C a l c u l a t i o n _ S u b _ T y p e   E l e m e n t T y p e = " C o l u m n "   E l e m e n t I d = " 1 3 7 0 5 5 6 6 2 4 "   D a t a T y p e = " O p t i o n " > C a l c u l a t i o n _ S u b _ T y p e < / C a l c u l a t i o n _ S u b _ T y p e > - 
-             < C o m p a n y _ O w n e r _ N a m e   E l e m e n t T y p e = " C o l u m n "   E l e m e n t I d = " 1 4 4 0 9 4 1 0 4 4 "   D a t a T y p e = " T e x t " > C o m p a n y _ O w n e r _ N a m e < / C o m p a n y _ O w n e r _ N a m e > - 
-             < C o n t r a c t _ S t a t u s   E l e m e n t T y p e = " C o l u m n "   E l e m e n t I d = " 2 0 1 6 9 0 4 2 7 6 "   D a t a T y p e = " O p t i o n " > C o n t r a c t _ S t a t u s < / C o n t r a c t _ S t a t u s > - 
-             < M a n a g e m e n t _ F e e   E l e m e n t T y p e = " C o l u m n "   E l e m e n t I d = " 1 1 4 3 6 1 4 9 6 7 "   D a t a T y p e = " D e c i m a l " > M a n a g e m e n t _ F e e < / M a n a g e m e n t _ F e e > - 
-             < P e r c e n t a g e   E l e m e n t T y p e = " C o l u m n "   E l e m e n t I d = " 1 4 1 0 1 8 0 5 7 3 "   D a t a T y p e = " I n t e g e r " > P e r c e n t a g e < / P e r c e n t a g e > - 
-             < P e r c e n t a g e _ T y p e   E l e m e n t T y p e = " C o l u m n "   E l e m e n t I d = " 5 5 7 7 2 5 7 3 4 "   D a t a T y p e = " O p t i o n " > P e r c e n t a g e _ T y p e < / P e r c e n t a g e _ T y p e > - 
-             < P r o p e r t y _ M a n a g e m e n t _ C o m p a n y   E l e m e n t T y p e = " C o l u m n "   E l e m e n t I d = " 2 0 4 6 3 5 0 8 2 "   D a t a T y p e = " T e x t " > P r o p e r t y _ M a n a g e m e n t _ C o m p a n y < / P r o p e r t y _ M a n a g e m e n t _ C o m p a n y > - 
-             < P r o p e r t y _ N a m e   E l e m e n t T y p e = " C o l u m n "   E l e m e n t I d = " 1 2 9 1 8 2 3 7 9 8 "   D a t a T y p e = " T e x t " > P r o p e r t y _ N a m e < / P r o p e r t y _ N a m e > - 
-             < P r o p e r t y _ T y p e   E l e m e n t T y p e = " C o l u m n "   E l e m e n t I d = " 1 2 4 5 0 9 6 0 7 5 "   D a t a T y p e = " T e x t " > P r o p e r t y _ T y p e < / P r o p e r t y _ T y p e > - 
-             < V a l i d i t y _ P e r i o d   E l e m e n t T y p e = " C o l u m n "   E l e m e n t I d = " 1 0 6 3 4 8 5 8 4 3 "   D a t a T y p e = " T e x t " > V a l i d i t y _ P e r i o d < / V a l i d i t y _ P e r i o d > - 
-         < / M a n a g e m e n t _ F e e _ C a l c _ L i n e > - 
-     < / M a n a g e m e n t _ F e e _ C a l c _ H e a d e r > - 
- < / N a v W o r d R e p o r t X m l P a r t > 
-</file>
-
-<file path=customXml/item3.xml>��< ? x m l   v e r s i o n = " 1 . 0 "   e n c o d i n g = " u t f - 1 6 " ? > < N a v W o r d R e p o r t X m l P a r t   x m l n s = " u r n : m i c r o s o f t - d y n a m i c s - n a v / r e p o r t s / M a n a g e m e n t _ F e e _ C a l c u l a t i o n / 5 0 1 1 9 / " > - 
-     < B C R e p o r t I n f o r m a t i o n > - 
-         < R e p o r t M e t a d a t a > - 
-             < E x t e n s i o n I d > E x t e n s i o n   I D < / E x t e n s i o n I d > - 
-             < E x t e n s i o n N a m e > E x t e n s i o n   N a m e < / E x t e n s i o n N a m e > - 
-             < E x t e n s i o n P u b l i s h e r > E x t e n s i o n   P u b l i s h e r < / E x t e n s i o n P u b l i s h e r > - 
-             < E x t e n s i o n V e r s i o n > E x t e n s i o n   V e r s i o n < / E x t e n s i o n V e r s i o n > - 
-             < R e p o r t I d > R e p o r t   I D < / R e p o r t I d > - 
-             < R e p o r t N a m e > R e p o r t   N a m e < / R e p o r t N a m e > - 
-             < A b o u t T h i s R e p o r t T i t l e > A b o u t   T h i s   R e p o r t   T i t l e < / A b o u t T h i s R e p o r t T i t l e > - 
-             < A b o u t T h i s R e p o r t T e x t > A b o u t   T h i s   R e p o r t   T e x t < / A b o u t T h i s R e p o r t T e x t > - 
-             < R e p o r t H e l p L i n k > R e p o r t   H e l p   L i n k < / R e p o r t H e l p L i n k > - 
-         < / R e p o r t M e t a d a t a > - 
-         < R e p o r t R e q u e s t > - 
-             < T e n a n t E n t r a I d > T e n a n t   E n t r a   I d < / T e n a n t E n t r a I d > - 
-             < E n v i r o n m e n t N a m e > E n v i r o n m e n t   N a m e < / E n v i r o n m e n t N a m e > - 
-             < E n v i r o n m e n t T y p e > E n v i r o n m e n t   T y p e < / E n v i r o n m e n t T y p e > - 
-             < C o m p a n y N a m e > C o m p a n y   N a m e < / C o m p a n y N a m e > - 
-             < C o m p a n y D i s p l a y N a m e > C o m p a n y   D i s p l a y   N a m e < / C o m p a n y D i s p l a y N a m e > - 
-             < C o m p a n y I d > C o m p a n y   I D < / C o m p a n y I d > - 
-             < U s e r N a m e > U s e r   N a m e < / U s e r N a m e > - 
-             < D a t e A n d T i m e > D a t e   a n d   T i m e < / D a t e A n d T i m e > - 
-             < L a n g u a g e > L a n g u a g e < / L a n g u a g e > - 
-             < F o r m a t R e g i o n > F o r m a t   R e g i o n < / F o r m a t R e g i o n > - 
-             < D a t e T i m e V a l u e s > - 
-                 < Y e a r > Y e a r < / Y e a r > - 
-                 < M o n t h N u m b e r > M o n t h   N u m b e r < / M o n t h N u m b e r > - 
-                 < D a y N u m b e r > D a y   N u m b e r < / D a y N u m b e r > - 
-                 < H o u r > H o u r < / H o u r > - 
-                 < M i n u t e > M i n u t e < / M i n u t e > - 
-             < / D a t e T i m e V a l u e s > - 
-         < / R e p o r t R e q u e s t > - 
-     < / B C R e p o r t I n f o r m a t i o n > - 
-     < M a n a g e m e n t _ F e e _ C a l c _ H e a d e r > - 
-         < F i n a n c i a l _ Y e a r > F i n a n c i a l _ Y e a r < / F i n a n c i a l _ Y e a r > - 
-         < O w n e r _ N a m e > O w n e r _ N a m e < / O w n e r _ N a m e > - 
-         < P e r i o d _ F r o m > P e r i o d _ F r o m < / P e r i o d _ F r o m > - 
-         < P e r i o d _ T o > P e r i o d _ T o < / P e r i o d _ T o > - 
-         < P r o p e r t y > P r o p e r t y < / P r o p e r t y > - 
-         < R e p o r t _ D a t e > R e p o r t _ D a t e < / R e p o r t _ D a t e > - 
-         < T o t a l _ M a n a g e m e n t _ F e e > T o t a l _ M a n a g e m e n t _ F e e < / T o t a l _ M a n a g e m e n t _ F e e > - 
-         < M a n a g e m e n t _ F e e _ C a l c _ L i n e > - 
-             < A m o u n t > A m o u n t < / A m o u n t > - 
-             < B a s e _ A m o u n t > B a s e _ A m o u n t < / B a s e _ A m o u n t > - 
-             < B a s e _ A m o u n t _ S o u r c e > B a s e _ A m o u n t _ S o u r c e < / B a s e _ A m o u n t _ S o u r c e > - 
-             < C a l c u l a t i o n _ M e t h o d > C a l c u l a t i o n _ M e t h o d < / C a l c u l a t i o n _ M e t h o d > - 
-             < C a l c u l a t i o n _ S u b _ T y p e > C a l c u l a t i o n _ S u b _ T y p e < / C a l c u l a t i o n _ S u b _ T y p e > - 
-             < C o m p a n y _ O w n e r _ N a m e > C o m p a n y _ O w n e r _ N a m e < / C o m p a n y _ O w n e r _ N a m e > - 
-             < C o n t r a c t _ S t a t u s > C o n t r a c t _ S t a t u s < / C o n t r a c t _ S t a t u s > - 
-             < M a n a g e m e n t _ F e e > M a n a g e m e n t _ F e e < / M a n a g e m e n t _ F e e > - 
-             < P e r c e n t a g e > P e r c e n t a g e < / P e r c e n t a g e > - 
-             < P e r c e n t a g e _ T y p e > P e r c e n t a g e _ T y p e < / P e r c e n t a g e _ T y p e > - 
-             < P r o p e r t y _ M a n a g e m e n t _ C o m p a n y > P r o p e r t y _ M a n a g e m e n t _ C o m p a n y < / P r o p e r t y _ M a n a g e m e n t _ C o m p a n y > - 
-             < P r o p e r t y _ N a m e > P r o p e r t y _ N a m e < / P r o p e r t y _ N a m e > - 
-             < P r o p e r t y _ T y p e > P r o p e r t y _ T y p e < / P r o p e r t y _ T y p e > - 
-             < V a l i d i t y _ P e r i o d > V a l i d i t y _ P e r i o d < / V a l i d i t y _ P e r i o d > - 
-         < / M a n a g e m e n t _ F e e _ C a l c _ L i n e > - 
-     < / M a n a g e m e n t _ F e e _ C a l c _ H e a d e r > - 
- < / N a v W o r d R e p o r t X m l P a r t > 
-</file>
-
 <file path=customXml/itemProps1.xml><?xml version="1.0" encoding="utf-8"?>
-<ds:datastoreItem xmlns:ds="http://schemas.openxmlformats.org/officeDocument/2006/customXml" ds:itemID="{E3F164C4-181D-4AB2-9E77-AED3AA5ABCF5}">
+<ds:datastoreItem xmlns:ds="http://schemas.openxmlformats.org/officeDocument/2006/customXml" ds:itemID="{F525D34B-9F89-4FBE-9311-0F7E641D4220}">
   <ds:schemaRefs>
-    <ds:schemaRef ds:uri="http://schemas.openxmlformats.org/officeDocument/2006/bibliography"/>
+    <ds:schemaRef ds:uri="urn:microsoft-dynamics-nav/reports/Management_Fee_Calculation/50119/"/>
   </ds:schemaRefs>
 </ds:datastoreItem>
 </file>
@@ -3475,9 +3460,9 @@
 </file>
 
 <file path=customXml/itemProps3.xml><?xml version="1.0" encoding="utf-8"?>
-<ds:datastoreItem xmlns:ds="http://schemas.openxmlformats.org/officeDocument/2006/customXml" ds:itemID="{F525D34B-9F89-4FBE-9311-0F7E641D4220}">
+<ds:datastoreItem xmlns:ds="http://schemas.openxmlformats.org/officeDocument/2006/customXml" ds:itemID="{E3F164C4-181D-4AB2-9E77-AED3AA5ABCF5}">
   <ds:schemaRefs>
-    <ds:schemaRef ds:uri="urn:microsoft-dynamics-nav/reports/Management_Fee_Calculation/50119/"/>
+    <ds:schemaRef ds:uri="http://schemas.openxmlformats.org/officeDocument/2006/bibliography"/>
   </ds:schemaRefs>
 </ds:datastoreItem>
 </file>
</xml_diff>

<commit_message>
Refactor management fee calculations and update related pages; add Management Fee Calculation List page
</commit_message>
<xml_diff>
--- a/ManagementFeeCalculation.docx
+++ b/ManagementFeeCalculation.docx
@@ -7,12 +7,12 @@
         <w:tblStyle w:val="TableGrid"/>
         <w:tblW w:w="0" w:type="auto"/>
         <w:tblBorders>
-          <w:top w:val="none" w:sz="0" w:space="0" w:color="auto"/>
-          <w:left w:val="none" w:sz="0" w:space="0" w:color="auto"/>
-          <w:bottom w:val="none" w:sz="0" w:space="0" w:color="auto"/>
-          <w:right w:val="none" w:sz="0" w:space="0" w:color="auto"/>
-          <w:insideH w:val="none" w:sz="0" w:space="0" w:color="auto"/>
-          <w:insideV w:val="none" w:sz="0" w:space="0" w:color="auto"/>
+          <w:top w:val="none" w:color="auto" w:sz="0" w:space="0"/>
+          <w:left w:val="none" w:color="auto" w:sz="0" w:space="0"/>
+          <w:bottom w:val="none" w:color="auto" w:sz="0" w:space="0"/>
+          <w:right w:val="none" w:color="auto" w:sz="0" w:space="0"/>
+          <w:insideH w:val="none" w:color="auto" w:sz="0" w:space="0"/>
+          <w:insideV w:val="none" w:color="auto" w:sz="0" w:space="0"/>
         </w:tblBorders>
         <w:tblLook w:val="04A0" w:firstRow="1" w:lastRow="0" w:firstColumn="1" w:lastColumn="0" w:noHBand="0" w:noVBand="1"/>
       </w:tblPr>
@@ -1317,14 +1317,14 @@
               <w:b/>
               <w:bCs/>
             </w:rPr>
-            <w:alias w:val="#Nav: /Management_Fee_Calc_Header/Total_Management_Fee"/>
-            <w:tag w:val="#Nav: Management_Fee_Calculation/50119"/>
-            <w:id w:val="419234094"/>
+            <w:id w:val="-2117206480"/>
             <w:placeholder>
-              <w:docPart w:val="47C3CF205F094A3FB275C798804D940D"/>
+              <w:docPart w:val="DefaultPlaceholder_-1854013440"/>
             </w:placeholder>
             <w:dataBinding w:prefixMappings="xmlns:ns0='urn:microsoft-dynamics-nav/reports/Management_Fee_Calculation/50119/' " w:xpath="/ns0:NavWordReportXmlPart[1]/ns0:Management_Fee_Calc_Header[1]/ns0:Total_Management_Fee[1]" w:storeItemID="{F525D34B-9F89-4FBE-9311-0F7E641D4220}"/>
             <w:text/>
+            <w:alias w:val="#Nav: /Management_Fee_Calc_Header/Total_Management_Fee"/>
+            <w:tag w:val="#Nav: Management_Fee_Calculation/50119"/>
           </w:sdtPr>
           <w:sdtContent>
             <w:tc>
@@ -1534,7 +1534,7 @@
         <w:sz w:val="20"/>
         <w:szCs w:val="20"/>
       </w:rPr>
-      <w:ptab w:relativeTo="margin" w:alignment="center" w:leader="none"/>
+      <w:ptab w:alignment="center" w:relativeTo="margin" w:leader="none"/>
     </w:r>
     <w:r>
       <w:rPr>
@@ -1542,7 +1542,7 @@
         <w:sz w:val="20"/>
         <w:szCs w:val="20"/>
       </w:rPr>
-      <w:ptab w:relativeTo="margin" w:alignment="right" w:leader="none"/>
+      <w:ptab w:alignment="right" w:relativeTo="margin" w:leader="none"/>
     </w:r>
   </w:p>
 </w:ftr>
@@ -2324,14 +2324,17 @@
   </w:compat>
   <w:rsids>
     <w:rsidRoot w:val="004353A3"/>
+    <w:rsid w:val="000B6F83"/>
     <w:rsid w:val="0011364E"/>
     <w:rsid w:val="00205DAD"/>
     <w:rsid w:val="003A7BED"/>
     <w:rsid w:val="003B7CCB"/>
     <w:rsid w:val="004353A3"/>
     <w:rsid w:val="004405F4"/>
+    <w:rsid w:val="0059618A"/>
     <w:rsid w:val="00645093"/>
     <w:rsid w:val="006B1911"/>
+    <w:rsid w:val="007F4B30"/>
     <w:rsid w:val="007F5399"/>
     <w:rsid w:val="0099227A"/>
     <w:rsid w:val="00B6268F"/>
@@ -2801,14 +2804,6 @@
       <w:color w:val="666666"/>
     </w:rPr>
   </w:style>
-  <w:style w:type="paragraph" w:customStyle="1" w:styleId="7F8DF0B5D88C439A9D3A08214DCC9C55">
-    <w:name w:val="7F8DF0B5D88C439A9D3A08214DCC9C55"/>
-    <w:rsid w:val="00C5127F"/>
-  </w:style>
-  <w:style w:type="paragraph" w:customStyle="1" w:styleId="F0D7E846625D4DBAA09CDED65DA9243A">
-    <w:name w:val="F0D7E846625D4DBAA09CDED65DA9243A"/>
-    <w:rsid w:val="00C5127F"/>
-  </w:style>
   <w:style w:type="paragraph" w:customStyle="1" w:styleId="2E95DEF7D1524AD9A74D4EAE039A25D2">
     <w:name w:val="2E95DEF7D1524AD9A74D4EAE039A25D2"/>
     <w:rsid w:val="00C5127F"/>
@@ -3122,254 +3117,254 @@
 </a:theme>
 </file>
 
-<file path=customXml/item1.xml><?xml version="1.0" encoding="utf-8"?>
+<file path=customXml/item1.xml>��< ? x m l   v e r s i o n = " 1 . 0 "   e n c o d i n g = " u t f - 1 6 " ? > < N a v W o r d R e p o r t X m l P a r t   x m l n s = " u r n : m i c r o s o f t - d y n a m i c s - n a v / r e p o r t s / M a n a g e m e n t _ F e e _ C a l c u l a t i o n / 5 0 1 1 9 / " > + 
+     < B C R e p o r t I n f o r m a t i o n > + 
+         < R e p o r t M e t a d a t a > + 
+             < E x t e n s i o n I d > E x t e n s i o n   I D < / E x t e n s i o n I d > + 
+             < E x t e n s i o n N a m e > E x t e n s i o n   N a m e < / E x t e n s i o n N a m e > + 
+             < E x t e n s i o n P u b l i s h e r > E x t e n s i o n   P u b l i s h e r < / E x t e n s i o n P u b l i s h e r > + 
+             < E x t e n s i o n V e r s i o n > E x t e n s i o n   V e r s i o n < / E x t e n s i o n V e r s i o n > + 
+             < R e p o r t I d > R e p o r t   I D < / R e p o r t I d > + 
+             < R e p o r t N a m e > R e p o r t   N a m e < / R e p o r t N a m e > + 
+             < A b o u t T h i s R e p o r t T i t l e > A b o u t   T h i s   R e p o r t   T i t l e < / A b o u t T h i s R e p o r t T i t l e > + 
+             < A b o u t T h i s R e p o r t T e x t > A b o u t   T h i s   R e p o r t   T e x t < / A b o u t T h i s R e p o r t T e x t > + 
+             < R e p o r t H e l p L i n k > R e p o r t   H e l p   L i n k < / R e p o r t H e l p L i n k > + 
+         < / R e p o r t M e t a d a t a > + 
+         < R e p o r t R e q u e s t > + 
+             < T e n a n t E n t r a I d > T e n a n t   E n t r a   I d < / T e n a n t E n t r a I d > + 
+             < E n v i r o n m e n t N a m e > E n v i r o n m e n t   N a m e < / E n v i r o n m e n t N a m e > + 
+             < E n v i r o n m e n t T y p e > E n v i r o n m e n t   T y p e < / E n v i r o n m e n t T y p e > + 
+             < C o m p a n y N a m e > C o m p a n y   N a m e < / C o m p a n y N a m e > + 
+             < C o m p a n y D i s p l a y N a m e > C o m p a n y   D i s p l a y   N a m e < / C o m p a n y D i s p l a y N a m e > + 
+             < C o m p a n y I d > C o m p a n y   I D < / C o m p a n y I d > + 
+             < U s e r N a m e > U s e r   N a m e < / U s e r N a m e > + 
+             < D a t e A n d T i m e > D a t e   a n d   T i m e < / D a t e A n d T i m e > + 
+             < L a n g u a g e > L a n g u a g e < / L a n g u a g e > + 
+             < F o r m a t R e g i o n > F o r m a t   R e g i o n < / F o r m a t R e g i o n > + 
+             < D a t e T i m e V a l u e s > + 
+                 < Y e a r > Y e a r < / Y e a r > + 
+                 < M o n t h N u m b e r > M o n t h   N u m b e r < / M o n t h N u m b e r > + 
+                 < D a y N u m b e r > D a y   N u m b e r < / D a y N u m b e r > + 
+                 < H o u r > H o u r < / H o u r > + 
+                 < M i n u t e > M i n u t e < / M i n u t e > + 
+             < / D a t e T i m e V a l u e s > + 
+         < / R e p o r t R e q u e s t > + 
+     < / B C R e p o r t I n f o r m a t i o n > + 
+     < M a n a g e m e n t _ F e e _ C a l c _ H e a d e r > + 
+         < F i n a n c i a l _ Y e a r > F i n a n c i a l _ Y e a r < / F i n a n c i a l _ Y e a r > + 
+         < O w n e r _ N a m e > O w n e r _ N a m e < / O w n e r _ N a m e > + 
+         < P e r i o d _ F r o m > P e r i o d _ F r o m < / P e r i o d _ F r o m > + 
+         < P e r i o d _ T o > P e r i o d _ T o < / P e r i o d _ T o > + 
+         < P r o p e r t y > P r o p e r t y < / P r o p e r t y > + 
+         < R e p o r t _ D a t e > R e p o r t _ D a t e < / R e p o r t _ D a t e > + 
+         < T o t a l _ M a n a g e m e n t _ F e e > T o t a l _ M a n a g e m e n t _ F e e < / T o t a l _ M a n a g e m e n t _ F e e > + 
+         < M a n a g e m e n t _ F e e _ C a l c _ L i n e > + 
+             < A m o u n t > A m o u n t < / A m o u n t > + 
+             < B a s e _ A m o u n t > B a s e _ A m o u n t < / B a s e _ A m o u n t > + 
+             < B a s e _ A m o u n t _ S o u r c e > B a s e _ A m o u n t _ S o u r c e < / B a s e _ A m o u n t _ S o u r c e > + 
+             < C a l c u l a t i o n _ M e t h o d > C a l c u l a t i o n _ M e t h o d < / C a l c u l a t i o n _ M e t h o d > + 
+             < C a l c u l a t i o n _ S u b _ T y p e > C a l c u l a t i o n _ S u b _ T y p e < / C a l c u l a t i o n _ S u b _ T y p e > + 
+             < C o m p a n y _ O w n e r _ N a m e > C o m p a n y _ O w n e r _ N a m e < / C o m p a n y _ O w n e r _ N a m e > + 
+             < C o n t r a c t _ S t a t u s > C o n t r a c t _ S t a t u s < / C o n t r a c t _ S t a t u s > + 
+             < M a n a g e m e n t _ F e e > M a n a g e m e n t _ F e e < / M a n a g e m e n t _ F e e > + 
+             < P e r c e n t a g e > P e r c e n t a g e < / P e r c e n t a g e > + 
+             < P e r c e n t a g e _ T y p e > P e r c e n t a g e _ T y p e < / P e r c e n t a g e _ T y p e > + 
+             < P r o p e r t y _ M a n a g e m e n t _ C o m p a n y > P r o p e r t y _ M a n a g e m e n t _ C o m p a n y < / P r o p e r t y _ M a n a g e m e n t _ C o m p a n y > + 
+             < P r o p e r t y _ N a m e > P r o p e r t y _ N a m e < / P r o p e r t y _ N a m e > + 
+             < P r o p e r t y _ T y p e > P r o p e r t y _ T y p e < / P r o p e r t y _ T y p e > + 
+             < V a l i d i t y _ P e r i o d > V a l i d i t y _ P e r i o d < / V a l i d i t y _ P e r i o d > + 
+         < / M a n a g e m e n t _ F e e _ C a l c _ L i n e > + 
+     < / M a n a g e m e n t _ F e e _ C a l c _ H e a d e r > + 
+ < / N a v W o r d R e p o r t X m l P a r t > 
+</file>
+
+<file path=customXml/item2.xml>��< ? x m l   v e r s i o n = " 1 . 0 "   e n c o d i n g = " u t f - 1 6 " ? > < N a v W o r d R e p o r t X m l P a r t   x m l n s = " u r n : m i c r o s o f t - d y n a m i c s - b u s i n e s s c e n t r a l / i n t e r n a l / e x t e n d e d / r e p o r t s / M a n a g e m e n t _ F e e _ C a l c u l a t i o n / 5 0 1 1 9 / " > + 
+     < B C R e p o r t I n f o r m a t i o n > + 
+         < R e p o r t M e t a d a t a > + 
+             < E x t e n s i o n I d > E x t e n s i o n   I D < / E x t e n s i o n I d > + 
+             < E x t e n s i o n N a m e > E x t e n s i o n   N a m e < / E x t e n s i o n N a m e > + 
+             < E x t e n s i o n P u b l i s h e r > E x t e n s i o n   P u b l i s h e r < / E x t e n s i o n P u b l i s h e r > + 
+             < E x t e n s i o n V e r s i o n > E x t e n s i o n   V e r s i o n < / E x t e n s i o n V e r s i o n > + 
+             < R e p o r t I d > R e p o r t   I D < / R e p o r t I d > + 
+             < R e p o r t N a m e > R e p o r t   N a m e < / R e p o r t N a m e > + 
+             < A b o u t T h i s R e p o r t T i t l e > A b o u t   T h i s   R e p o r t   T i t l e < / A b o u t T h i s R e p o r t T i t l e > + 
+             < A b o u t T h i s R e p o r t T e x t > A b o u t   T h i s   R e p o r t   T e x t < / A b o u t T h i s R e p o r t T e x t > + 
+             < R e p o r t H e l p L i n k > R e p o r t   H e l p   L i n k < / R e p o r t H e l p L i n k > + 
+         < / R e p o r t M e t a d a t a > + 
+         < R e p o r t R e q u e s t > + 
+             < T e n a n t E n t r a I d > T e n a n t   E n t r a   I d < / T e n a n t E n t r a I d > + 
+             < E n v i r o n m e n t N a m e > E n v i r o n m e n t   N a m e < / E n v i r o n m e n t N a m e > + 
+             < E n v i r o n m e n t T y p e > E n v i r o n m e n t   T y p e < / E n v i r o n m e n t T y p e > + 
+             < C o m p a n y N a m e > C o m p a n y   N a m e < / C o m p a n y N a m e > + 
+             < C o m p a n y D i s p l a y N a m e > C o m p a n y   D i s p l a y   N a m e < / C o m p a n y D i s p l a y N a m e > + 
+             < C o m p a n y I d > C o m p a n y   I D < / C o m p a n y I d > + 
+             < U s e r N a m e > U s e r   N a m e < / U s e r N a m e > + 
+             < D a t e A n d T i m e > D a t e   a n d   T i m e < / D a t e A n d T i m e > + 
+             < L a n g u a g e > L a n g u a g e < / L a n g u a g e > + 
+             < F o r m a t R e g i o n > F o r m a t   R e g i o n < / F o r m a t R e g i o n > + 
+             < D a t e T i m e V a l u e s > + 
+                 < Y e a r > Y e a r < / Y e a r > + 
+                 < M o n t h N u m b e r > M o n t h   N u m b e r < / M o n t h N u m b e r > + 
+                 < D a y N u m b e r > D a y   N u m b e r < / D a y N u m b e r > + 
+                 < H o u r > H o u r < / H o u r > + 
+                 < M i n u t e > M i n u t e < / M i n u t e > + 
+             < / D a t e T i m e V a l u e s > + 
+         < / R e p o r t R e q u e s t > + 
+     < / B C R e p o r t I n f o r m a t i o n > + 
+     < T o o l t i p s / > + 
+     < M a n a g e m e n t _ F e e _ C a l c _ H e a d e r   E l e m e n t T y p e = " D a t a I t e m "   E l e m e n t I d = " 1 4 7 8 3 1 3 7 4 7 " > + 
+         < F i n a n c i a l _ Y e a r   E l e m e n t T y p e = " C o l u m n "   E l e m e n t I d = " 6 1 2 1 1 5 9 0 8 "   D a t a T y p e = " I n t e g e r " > F i n a n c i a l _ Y e a r < / F i n a n c i a l _ Y e a r > + 
+         < O w n e r _ N a m e   E l e m e n t T y p e = " C o l u m n "   E l e m e n t I d = " 1 3 5 5 2 3 0 7 8 0 "   D a t a T y p e = " T e x t " > O w n e r _ N a m e < / O w n e r _ N a m e > + 
+         < P e r i o d _ F r o m   E l e m e n t T y p e = " C o l u m n "   E l e m e n t I d = " 5 4 5 9 3 1 6 0 7 "   D a t a T y p e = " D a t e " > P e r i o d _ F r o m < / P e r i o d _ F r o m > + 
+         < P e r i o d _ T o   E l e m e n t T y p e = " C o l u m n "   E l e m e n t I d = " 4 3 2 5 1 1 5 9 6 "   D a t a T y p e = " D a t e " > P e r i o d _ T o < / P e r i o d _ T o > + 
+         < P r o p e r t y   E l e m e n t T y p e = " C o l u m n "   E l e m e n t I d = " 1 8 0 5 8 9 6 7 0 "   D a t a T y p e = " T e x t " > P r o p e r t y < / P r o p e r t y > + 
+         < R e p o r t _ D a t e   E l e m e n t T y p e = " C o l u m n "   E l e m e n t I d = " 2 1 0 3 3 2 7 2 0 "   D a t a T y p e = " D a t e " > R e p o r t _ D a t e < / R e p o r t _ D a t e > + 
+         < T o t a l _ M a n a g e m e n t _ F e e   E l e m e n t T y p e = " C o l u m n "   E l e m e n t I d = " 1 0 8 4 7 4 0 8 3 4 "   D a t a T y p e = " D e c i m a l " > T o t a l _ M a n a g e m e n t _ F e e < / T o t a l _ M a n a g e m e n t _ F e e > + 
+         < M a n a g e m e n t _ F e e _ C a l c _ L i n e   E l e m e n t T y p e = " D a t a I t e m "   E l e m e n t I d = " 8 7 9 9 9 6 9 4 8 " > + 
+             < A m o u n t   E l e m e n t T y p e = " C o l u m n "   E l e m e n t I d = " 1 5 1 1 0 9 1 2 7 1 "   D a t a T y p e = " D e c i m a l " > A m o u n t < / A m o u n t > + 
+             < B a s e _ A m o u n t   E l e m e n t T y p e = " C o l u m n "   E l e m e n t I d = " 8 9 0 0 3 8 4 7 5 "   D a t a T y p e = " D e c i m a l " > B a s e _ A m o u n t < / B a s e _ A m o u n t > + 
+             < B a s e _ A m o u n t _ S o u r c e   E l e m e n t T y p e = " C o l u m n "   E l e m e n t I d = " 8 5 1 3 1 2 0 5 7 "   D a t a T y p e = " O p t i o n " > B a s e _ A m o u n t _ S o u r c e < / B a s e _ A m o u n t _ S o u r c e > + 
+             < C a l c u l a t i o n _ M e t h o d   E l e m e n t T y p e = " C o l u m n "   E l e m e n t I d = " 5 5 3 6 6 7 0 1 2 "   D a t a T y p e = " O p t i o n " > C a l c u l a t i o n _ M e t h o d < / C a l c u l a t i o n _ M e t h o d > + 
+             < C a l c u l a t i o n _ S u b _ T y p e   E l e m e n t T y p e = " C o l u m n "   E l e m e n t I d = " 1 3 7 0 5 5 6 6 2 4 "   D a t a T y p e = " O p t i o n " > C a l c u l a t i o n _ S u b _ T y p e < / C a l c u l a t i o n _ S u b _ T y p e > + 
+             < C o m p a n y _ O w n e r _ N a m e   E l e m e n t T y p e = " C o l u m n "   E l e m e n t I d = " 1 4 4 0 9 4 1 0 4 4 "   D a t a T y p e = " T e x t " > C o m p a n y _ O w n e r _ N a m e < / C o m p a n y _ O w n e r _ N a m e > + 
+             < C o n t r a c t _ S t a t u s   E l e m e n t T y p e = " C o l u m n "   E l e m e n t I d = " 2 0 1 6 9 0 4 2 7 6 "   D a t a T y p e = " O p t i o n " > C o n t r a c t _ S t a t u s < / C o n t r a c t _ S t a t u s > + 
+             < M a n a g e m e n t _ F e e   E l e m e n t T y p e = " C o l u m n "   E l e m e n t I d = " 1 1 4 3 6 1 4 9 6 7 "   D a t a T y p e = " D e c i m a l " > M a n a g e m e n t _ F e e < / M a n a g e m e n t _ F e e > + 
+             < P e r c e n t a g e   E l e m e n t T y p e = " C o l u m n "   E l e m e n t I d = " 1 4 1 0 1 8 0 5 7 3 "   D a t a T y p e = " I n t e g e r " > P e r c e n t a g e < / P e r c e n t a g e > + 
+             < P e r c e n t a g e _ T y p e   E l e m e n t T y p e = " C o l u m n "   E l e m e n t I d = " 5 5 7 7 2 5 7 3 4 "   D a t a T y p e = " O p t i o n " > P e r c e n t a g e _ T y p e < / P e r c e n t a g e _ T y p e > + 
+             < P r o p e r t y _ M a n a g e m e n t _ C o m p a n y   E l e m e n t T y p e = " C o l u m n "   E l e m e n t I d = " 2 0 4 6 3 5 0 8 2 "   D a t a T y p e = " T e x t " > P r o p e r t y _ M a n a g e m e n t _ C o m p a n y < / P r o p e r t y _ M a n a g e m e n t _ C o m p a n y > + 
+             < P r o p e r t y _ N a m e   E l e m e n t T y p e = " C o l u m n "   E l e m e n t I d = " 1 2 9 1 8 2 3 7 9 8 "   D a t a T y p e = " T e x t " > P r o p e r t y _ N a m e < / P r o p e r t y _ N a m e > + 
+             < P r o p e r t y _ T y p e   E l e m e n t T y p e = " C o l u m n "   E l e m e n t I d = " 1 2 4 5 0 9 6 0 7 5 "   D a t a T y p e = " T e x t " > P r o p e r t y _ T y p e < / P r o p e r t y _ T y p e > + 
+             < V a l i d i t y _ P e r i o d   E l e m e n t T y p e = " C o l u m n "   E l e m e n t I d = " 1 0 6 3 4 8 5 8 4 3 "   D a t a T y p e = " T e x t " > V a l i d i t y _ P e r i o d < / V a l i d i t y _ P e r i o d > + 
+         < / M a n a g e m e n t _ F e e _ C a l c _ L i n e > + 
+     < / M a n a g e m e n t _ F e e _ C a l c _ H e a d e r > + 
+ < / N a v W o r d R e p o r t X m l P a r t > 
+</file>
+
+<file path=customXml/item3.xml><?xml version="1.0" encoding="utf-8"?>
 <b:Sources xmlns:b="http://schemas.openxmlformats.org/officeDocument/2006/bibliography" xmlns="http://schemas.openxmlformats.org/officeDocument/2006/bibliography" SelectedStyle="\APASixthEditionOfficeOnline.xsl" StyleName="APA" Version="6"/>
 </file>
 
-<file path=customXml/item2.xml>��< ? x m l   v e r s i o n = " 1 . 0 "   e n c o d i n g = " u t f - 1 6 " ? > < N a v W o r d R e p o r t X m l P a r t   x m l n s = " u r n : m i c r o s o f t - d y n a m i c s - b u s i n e s s c e n t r a l / i n t e r n a l / e x t e n d e d / r e p o r t s / M a n a g e m e n t _ F e e _ C a l c u l a t i o n / 5 0 1 1 9 / " > - 
-     < B C R e p o r t I n f o r m a t i o n > - 
-         < R e p o r t M e t a d a t a > - 
-             < E x t e n s i o n I d > E x t e n s i o n   I D < / E x t e n s i o n I d > - 
-             < E x t e n s i o n N a m e > E x t e n s i o n   N a m e < / E x t e n s i o n N a m e > - 
-             < E x t e n s i o n P u b l i s h e r > E x t e n s i o n   P u b l i s h e r < / E x t e n s i o n P u b l i s h e r > - 
-             < E x t e n s i o n V e r s i o n > E x t e n s i o n   V e r s i o n < / E x t e n s i o n V e r s i o n > - 
-             < R e p o r t I d > R e p o r t   I D < / R e p o r t I d > - 
-             < R e p o r t N a m e > R e p o r t   N a m e < / R e p o r t N a m e > - 
-             < A b o u t T h i s R e p o r t T i t l e > A b o u t   T h i s   R e p o r t   T i t l e < / A b o u t T h i s R e p o r t T i t l e > - 
-             < A b o u t T h i s R e p o r t T e x t > A b o u t   T h i s   R e p o r t   T e x t < / A b o u t T h i s R e p o r t T e x t > - 
-             < R e p o r t H e l p L i n k > R e p o r t   H e l p   L i n k < / R e p o r t H e l p L i n k > - 
-         < / R e p o r t M e t a d a t a > - 
-         < R e p o r t R e q u e s t > - 
-             < T e n a n t E n t r a I d > T e n a n t   E n t r a   I d < / T e n a n t E n t r a I d > - 
-             < E n v i r o n m e n t N a m e > E n v i r o n m e n t   N a m e < / E n v i r o n m e n t N a m e > - 
-             < E n v i r o n m e n t T y p e > E n v i r o n m e n t   T y p e < / E n v i r o n m e n t T y p e > - 
-             < C o m p a n y N a m e > C o m p a n y   N a m e < / C o m p a n y N a m e > - 
-             < C o m p a n y D i s p l a y N a m e > C o m p a n y   D i s p l a y   N a m e < / C o m p a n y D i s p l a y N a m e > - 
-             < C o m p a n y I d > C o m p a n y   I D < / C o m p a n y I d > - 
-             < U s e r N a m e > U s e r   N a m e < / U s e r N a m e > - 
-             < D a t e A n d T i m e > D a t e   a n d   T i m e < / D a t e A n d T i m e > - 
-             < L a n g u a g e > L a n g u a g e < / L a n g u a g e > - 
-             < F o r m a t R e g i o n > F o r m a t   R e g i o n < / F o r m a t R e g i o n > - 
-             < D a t e T i m e V a l u e s > - 
-                 < Y e a r > Y e a r < / Y e a r > - 
-                 < M o n t h N u m b e r > M o n t h   N u m b e r < / M o n t h N u m b e r > - 
-                 < D a y N u m b e r > D a y   N u m b e r < / D a y N u m b e r > - 
-                 < H o u r > H o u r < / H o u r > - 
-                 < M i n u t e > M i n u t e < / M i n u t e > - 
-             < / D a t e T i m e V a l u e s > - 
-         < / R e p o r t R e q u e s t > - 
-     < / B C R e p o r t I n f o r m a t i o n > - 
-     < T o o l t i p s / > - 
-     < M a n a g e m e n t _ F e e _ C a l c _ H e a d e r   E l e m e n t T y p e = " D a t a I t e m "   E l e m e n t I d = " 1 4 7 8 3 1 3 7 4 7 " > - 
-         < F i n a n c i a l _ Y e a r   E l e m e n t T y p e = " C o l u m n "   E l e m e n t I d = " 6 1 2 1 1 5 9 0 8 "   D a t a T y p e = " I n t e g e r " > F i n a n c i a l _ Y e a r < / F i n a n c i a l _ Y e a r > - 
-         < O w n e r _ N a m e   E l e m e n t T y p e = " C o l u m n "   E l e m e n t I d = " 1 3 5 5 2 3 0 7 8 0 "   D a t a T y p e = " T e x t " > O w n e r _ N a m e < / O w n e r _ N a m e > - 
-         < P e r i o d _ F r o m   E l e m e n t T y p e = " C o l u m n "   E l e m e n t I d = " 5 4 5 9 3 1 6 0 7 "   D a t a T y p e = " D a t e " > P e r i o d _ F r o m < / P e r i o d _ F r o m > - 
-         < P e r i o d _ T o   E l e m e n t T y p e = " C o l u m n "   E l e m e n t I d = " 4 3 2 5 1 1 5 9 6 "   D a t a T y p e = " D a t e " > P e r i o d _ T o < / P e r i o d _ T o > - 
-         < P r o p e r t y   E l e m e n t T y p e = " C o l u m n "   E l e m e n t I d = " 1 8 0 5 8 9 6 7 0 "   D a t a T y p e = " T e x t " > P r o p e r t y < / P r o p e r t y > - 
-         < R e p o r t _ D a t e   E l e m e n t T y p e = " C o l u m n "   E l e m e n t I d = " 2 1 0 3 3 2 7 2 0 "   D a t a T y p e = " D a t e " > R e p o r t _ D a t e < / R e p o r t _ D a t e > - 
-         < T o t a l _ M a n a g e m e n t _ F e e   E l e m e n t T y p e = " C o l u m n "   E l e m e n t I d = " 1 0 8 4 7 4 0 8 3 4 "   D a t a T y p e = " D e c i m a l " > T o t a l _ M a n a g e m e n t _ F e e < / T o t a l _ M a n a g e m e n t _ F e e > - 
-         < M a n a g e m e n t _ F e e _ C a l c _ L i n e   E l e m e n t T y p e = " D a t a I t e m "   E l e m e n t I d = " 8 7 9 9 9 6 9 4 8 " > - 
-             < A m o u n t   E l e m e n t T y p e = " C o l u m n "   E l e m e n t I d = " 1 5 1 1 0 9 1 2 7 1 "   D a t a T y p e = " D e c i m a l " > A m o u n t < / A m o u n t > - 
-             < B a s e _ A m o u n t   E l e m e n t T y p e = " C o l u m n "   E l e m e n t I d = " 8 9 0 0 3 8 4 7 5 "   D a t a T y p e = " D e c i m a l " > B a s e _ A m o u n t < / B a s e _ A m o u n t > - 
-             < B a s e _ A m o u n t _ S o u r c e   E l e m e n t T y p e = " C o l u m n "   E l e m e n t I d = " 8 5 1 3 1 2 0 5 7 "   D a t a T y p e = " O p t i o n " > B a s e _ A m o u n t _ S o u r c e < / B a s e _ A m o u n t _ S o u r c e > - 
-             < C a l c u l a t i o n _ M e t h o d   E l e m e n t T y p e = " C o l u m n "   E l e m e n t I d = " 5 5 3 6 6 7 0 1 2 "   D a t a T y p e = " O p t i o n " > C a l c u l a t i o n _ M e t h o d < / C a l c u l a t i o n _ M e t h o d > - 
-             < C a l c u l a t i o n _ S u b _ T y p e   E l e m e n t T y p e = " C o l u m n "   E l e m e n t I d = " 1 3 7 0 5 5 6 6 2 4 "   D a t a T y p e = " O p t i o n " > C a l c u l a t i o n _ S u b _ T y p e < / C a l c u l a t i o n _ S u b _ T y p e > - 
-             < C o m p a n y _ O w n e r _ N a m e   E l e m e n t T y p e = " C o l u m n "   E l e m e n t I d = " 1 4 4 0 9 4 1 0 4 4 "   D a t a T y p e = " T e x t " > C o m p a n y _ O w n e r _ N a m e < / C o m p a n y _ O w n e r _ N a m e > - 
-             < C o n t r a c t _ S t a t u s   E l e m e n t T y p e = " C o l u m n "   E l e m e n t I d = " 2 0 1 6 9 0 4 2 7 6 "   D a t a T y p e = " O p t i o n " > C o n t r a c t _ S t a t u s < / C o n t r a c t _ S t a t u s > - 
-             < M a n a g e m e n t _ F e e   E l e m e n t T y p e = " C o l u m n "   E l e m e n t I d = " 1 1 4 3 6 1 4 9 6 7 "   D a t a T y p e = " D e c i m a l " > M a n a g e m e n t _ F e e < / M a n a g e m e n t _ F e e > - 
-             < P e r c e n t a g e   E l e m e n t T y p e = " C o l u m n "   E l e m e n t I d = " 1 4 1 0 1 8 0 5 7 3 "   D a t a T y p e = " I n t e g e r " > P e r c e n t a g e < / P e r c e n t a g e > - 
-             < P e r c e n t a g e _ T y p e   E l e m e n t T y p e = " C o l u m n "   E l e m e n t I d = " 5 5 7 7 2 5 7 3 4 "   D a t a T y p e = " O p t i o n " > P e r c e n t a g e _ T y p e < / P e r c e n t a g e _ T y p e > - 
-             < P r o p e r t y _ M a n a g e m e n t _ C o m p a n y   E l e m e n t T y p e = " C o l u m n "   E l e m e n t I d = " 2 0 4 6 3 5 0 8 2 "   D a t a T y p e = " T e x t " > P r o p e r t y _ M a n a g e m e n t _ C o m p a n y < / P r o p e r t y _ M a n a g e m e n t _ C o m p a n y > - 
-             < P r o p e r t y _ N a m e   E l e m e n t T y p e = " C o l u m n "   E l e m e n t I d = " 1 2 9 1 8 2 3 7 9 8 "   D a t a T y p e = " T e x t " > P r o p e r t y _ N a m e < / P r o p e r t y _ N a m e > - 
-             < P r o p e r t y _ T y p e   E l e m e n t T y p e = " C o l u m n "   E l e m e n t I d = " 1 2 4 5 0 9 6 0 7 5 "   D a t a T y p e = " T e x t " > P r o p e r t y _ T y p e < / P r o p e r t y _ T y p e > - 
-             < V a l i d i t y _ P e r i o d   E l e m e n t T y p e = " C o l u m n "   E l e m e n t I d = " 1 0 6 3 4 8 5 8 4 3 "   D a t a T y p e = " T e x t " > V a l i d i t y _ P e r i o d < / V a l i d i t y _ P e r i o d > - 
-         < / M a n a g e m e n t _ F e e _ C a l c _ L i n e > - 
-     < / M a n a g e m e n t _ F e e _ C a l c _ H e a d e r > - 
- < / N a v W o r d R e p o r t X m l P a r t > 
-</file>
-
-<file path=customXml/item3.xml>��< ? x m l   v e r s i o n = " 1 . 0 "   e n c o d i n g = " u t f - 1 6 " ? > < N a v W o r d R e p o r t X m l P a r t   x m l n s = " u r n : m i c r o s o f t - d y n a m i c s - n a v / r e p o r t s / M a n a g e m e n t _ F e e _ C a l c u l a t i o n / 5 0 1 1 9 / " > - 
-     < B C R e p o r t I n f o r m a t i o n > - 
-         < R e p o r t M e t a d a t a > - 
-             < E x t e n s i o n I d > E x t e n s i o n   I D < / E x t e n s i o n I d > - 
-             < E x t e n s i o n N a m e > E x t e n s i o n   N a m e < / E x t e n s i o n N a m e > - 
-             < E x t e n s i o n P u b l i s h e r > E x t e n s i o n   P u b l i s h e r < / E x t e n s i o n P u b l i s h e r > - 
-             < E x t e n s i o n V e r s i o n > E x t e n s i o n   V e r s i o n < / E x t e n s i o n V e r s i o n > - 
-             < R e p o r t I d > R e p o r t   I D < / R e p o r t I d > - 
-             < R e p o r t N a m e > R e p o r t   N a m e < / R e p o r t N a m e > - 
-             < A b o u t T h i s R e p o r t T i t l e > A b o u t   T h i s   R e p o r t   T i t l e < / A b o u t T h i s R e p o r t T i t l e > - 
-             < A b o u t T h i s R e p o r t T e x t > A b o u t   T h i s   R e p o r t   T e x t < / A b o u t T h i s R e p o r t T e x t > - 
-             < R e p o r t H e l p L i n k > R e p o r t   H e l p   L i n k < / R e p o r t H e l p L i n k > - 
-         < / R e p o r t M e t a d a t a > - 
-         < R e p o r t R e q u e s t > - 
-             < T e n a n t E n t r a I d > T e n a n t   E n t r a   I d < / T e n a n t E n t r a I d > - 
-             < E n v i r o n m e n t N a m e > E n v i r o n m e n t   N a m e < / E n v i r o n m e n t N a m e > - 
-             < E n v i r o n m e n t T y p e > E n v i r o n m e n t   T y p e < / E n v i r o n m e n t T y p e > - 
-             < C o m p a n y N a m e > C o m p a n y   N a m e < / C o m p a n y N a m e > - 
-             < C o m p a n y D i s p l a y N a m e > C o m p a n y   D i s p l a y   N a m e < / C o m p a n y D i s p l a y N a m e > - 
-             < C o m p a n y I d > C o m p a n y   I D < / C o m p a n y I d > - 
-             < U s e r N a m e > U s e r   N a m e < / U s e r N a m e > - 
-             < D a t e A n d T i m e > D a t e   a n d   T i m e < / D a t e A n d T i m e > - 
-             < L a n g u a g e > L a n g u a g e < / L a n g u a g e > - 
-             < F o r m a t R e g i o n > F o r m a t   R e g i o n < / F o r m a t R e g i o n > - 
-             < D a t e T i m e V a l u e s > - 
-                 < Y e a r > Y e a r < / Y e a r > - 
-                 < M o n t h N u m b e r > M o n t h   N u m b e r < / M o n t h N u m b e r > - 
-                 < D a y N u m b e r > D a y   N u m b e r < / D a y N u m b e r > - 
-                 < H o u r > H o u r < / H o u r > - 
-                 < M i n u t e > M i n u t e < / M i n u t e > - 
-             < / D a t e T i m e V a l u e s > - 
-         < / R e p o r t R e q u e s t > - 
-     < / B C R e p o r t I n f o r m a t i o n > - 
-     < M a n a g e m e n t _ F e e _ C a l c _ H e a d e r > - 
-         < F i n a n c i a l _ Y e a r > F i n a n c i a l _ Y e a r < / F i n a n c i a l _ Y e a r > - 
-         < O w n e r _ N a m e > O w n e r _ N a m e < / O w n e r _ N a m e > - 
-         < P e r i o d _ F r o m > P e r i o d _ F r o m < / P e r i o d _ F r o m > - 
-         < P e r i o d _ T o > P e r i o d _ T o < / P e r i o d _ T o > - 
-         < P r o p e r t y > P r o p e r t y < / P r o p e r t y > - 
-         < R e p o r t _ D a t e > R e p o r t _ D a t e < / R e p o r t _ D a t e > - 
-         < T o t a l _ M a n a g e m e n t _ F e e > T o t a l _ M a n a g e m e n t _ F e e < / T o t a l _ M a n a g e m e n t _ F e e > - 
-         < M a n a g e m e n t _ F e e _ C a l c _ L i n e > - 
-             < A m o u n t > A m o u n t < / A m o u n t > - 
-             < B a s e _ A m o u n t > B a s e _ A m o u n t < / B a s e _ A m o u n t > - 
-             < B a s e _ A m o u n t _ S o u r c e > B a s e _ A m o u n t _ S o u r c e < / B a s e _ A m o u n t _ S o u r c e > - 
-             < C a l c u l a t i o n _ M e t h o d > C a l c u l a t i o n _ M e t h o d < / C a l c u l a t i o n _ M e t h o d > - 
-             < C a l c u l a t i o n _ S u b _ T y p e > C a l c u l a t i o n _ S u b _ T y p e < / C a l c u l a t i o n _ S u b _ T y p e > - 
-             < C o m p a n y _ O w n e r _ N a m e > C o m p a n y _ O w n e r _ N a m e < / C o m p a n y _ O w n e r _ N a m e > - 
-             < C o n t r a c t _ S t a t u s > C o n t r a c t _ S t a t u s < / C o n t r a c t _ S t a t u s > - 
-             < M a n a g e m e n t _ F e e > M a n a g e m e n t _ F e e < / M a n a g e m e n t _ F e e > - 
-             < P e r c e n t a g e > P e r c e n t a g e < / P e r c e n t a g e > - 
-             < P e r c e n t a g e _ T y p e > P e r c e n t a g e _ T y p e < / P e r c e n t a g e _ T y p e > - 
-             < P r o p e r t y _ M a n a g e m e n t _ C o m p a n y > P r o p e r t y _ M a n a g e m e n t _ C o m p a n y < / P r o p e r t y _ M a n a g e m e n t _ C o m p a n y > - 
-             < P r o p e r t y _ N a m e > P r o p e r t y _ N a m e < / P r o p e r t y _ N a m e > - 
-             < P r o p e r t y _ T y p e > P r o p e r t y _ T y p e < / P r o p e r t y _ T y p e > - 
-             < V a l i d i t y _ P e r i o d > V a l i d i t y _ P e r i o d < / V a l i d i t y _ P e r i o d > - 
-         < / M a n a g e m e n t _ F e e _ C a l c _ L i n e > - 
-     < / M a n a g e m e n t _ F e e _ C a l c _ H e a d e r > - 
- < / N a v W o r d R e p o r t X m l P a r t > 
-</file>
-
 <file path=customXml/itemProps1.xml><?xml version="1.0" encoding="utf-8"?>
-<ds:datastoreItem xmlns:ds="http://schemas.openxmlformats.org/officeDocument/2006/customXml" ds:itemID="{E3F164C4-181D-4AB2-9E77-AED3AA5ABCF5}">
+<ds:datastoreItem xmlns:ds="http://schemas.openxmlformats.org/officeDocument/2006/customXml" ds:itemID="{F525D34B-9F89-4FBE-9311-0F7E641D4220}">
   <ds:schemaRefs>
-    <ds:schemaRef ds:uri="http://schemas.openxmlformats.org/officeDocument/2006/bibliography"/>
+    <ds:schemaRef ds:uri="urn:microsoft-dynamics-nav/reports/Management_Fee_Calculation/50119/"/>
   </ds:schemaRefs>
 </ds:datastoreItem>
 </file>
@@ -3383,9 +3378,9 @@
 </file>
 
 <file path=customXml/itemProps3.xml><?xml version="1.0" encoding="utf-8"?>
-<ds:datastoreItem xmlns:ds="http://schemas.openxmlformats.org/officeDocument/2006/customXml" ds:itemID="{F525D34B-9F89-4FBE-9311-0F7E641D4220}">
+<ds:datastoreItem xmlns:ds="http://schemas.openxmlformats.org/officeDocument/2006/customXml" ds:itemID="{E3F164C4-181D-4AB2-9E77-AED3AA5ABCF5}">
   <ds:schemaRefs>
-    <ds:schemaRef ds:uri="urn:microsoft-dynamics-nav/reports/Management_Fee_Calculation/50119/"/>
+    <ds:schemaRef ds:uri="http://schemas.openxmlformats.org/officeDocument/2006/bibliography"/>
   </ds:schemaRefs>
 </ds:datastoreItem>
 </file>
</xml_diff>